<commit_message>
Update HAI SCRIBE Involvement source document
Co-Authored-By: Claude Sonnet 5 <noreply@anthropic.com>
Claude-Session: https://claude.ai/code/session_01AmYkJts4wPcJFVL64atKcb
</commit_message>
<xml_diff>
--- a/HAI SCRIBE Involvement.docx
+++ b/HAI SCRIBE Involvement.docx
@@ -57,9 +57,9 @@
         <w:tblLook w:val="04A0" w:firstRow="1" w:lastRow="0" w:firstColumn="1" w:lastColumn="0" w:noHBand="0" w:noVBand="1"/>
       </w:tblPr>
       <w:tblGrid>
-        <w:gridCol w:w="2676"/>
-        <w:gridCol w:w="2246"/>
-        <w:gridCol w:w="4094"/>
+        <w:gridCol w:w="3719"/>
+        <w:gridCol w:w="3126"/>
+        <w:gridCol w:w="6777"/>
       </w:tblGrid>
       <w:tr>
         <w:trPr>
@@ -505,7 +505,7 @@
     <w:p>
       <w:r>
         <w:pict w14:anchorId="0CF29730">
-          <v:rect id="_x0000_i1037" style="width:0;height:1.5pt" o:hralign="center" o:hrstd="t" o:hr="t" fillcolor="#a0a0a0" stroked="f"/>
+          <v:rect id="_x0000_i1025" style="width:0;height:1.5pt" o:hralign="center" o:hrstd="t" o:hr="t" fillcolor="#a0a0a0" stroked="f"/>
         </w:pict>
       </w:r>
     </w:p>
@@ -572,6 +572,7 @@
           <w:b/>
           <w:bCs/>
         </w:rPr>
+        <w:lastRenderedPageBreak/>
         <w:t>M</w:t>
       </w:r>
       <w:r>
@@ -643,16 +644,16 @@
         <w:tblLook w:val="04A0" w:firstRow="1" w:lastRow="0" w:firstColumn="1" w:lastColumn="0" w:noHBand="0" w:noVBand="1"/>
       </w:tblPr>
       <w:tblGrid>
-        <w:gridCol w:w="475"/>
-        <w:gridCol w:w="2988"/>
-        <w:gridCol w:w="693"/>
-        <w:gridCol w:w="693"/>
-        <w:gridCol w:w="692"/>
-        <w:gridCol w:w="692"/>
-        <w:gridCol w:w="692"/>
-        <w:gridCol w:w="692"/>
-        <w:gridCol w:w="692"/>
-        <w:gridCol w:w="707"/>
+        <w:gridCol w:w="474"/>
+        <w:gridCol w:w="4283"/>
+        <w:gridCol w:w="774"/>
+        <w:gridCol w:w="774"/>
+        <w:gridCol w:w="774"/>
+        <w:gridCol w:w="774"/>
+        <w:gridCol w:w="774"/>
+        <w:gridCol w:w="774"/>
+        <w:gridCol w:w="774"/>
+        <w:gridCol w:w="789"/>
       </w:tblGrid>
       <w:tr>
         <w:trPr>
@@ -677,7 +678,6 @@
                 <w:b/>
                 <w:bCs/>
               </w:rPr>
-              <w:lastRenderedPageBreak/>
               <w:t>No.</w:t>
             </w:r>
           </w:p>
@@ -2380,6 +2380,7 @@
           </w:tcPr>
           <w:p>
             <w:r>
+              <w:lastRenderedPageBreak/>
               <w:t>12</w:t>
             </w:r>
           </w:p>
@@ -3150,7 +3151,7 @@
     <w:p>
       <w:r>
         <w:pict w14:anchorId="519EB2BA">
-          <v:rect id="_x0000_i1038" style="width:0;height:1.5pt" o:hralign="center" o:hrstd="t" o:hr="t" fillcolor="#a0a0a0" stroked="f"/>
+          <v:rect id="_x0000_i1026" style="width:0;height:1.5pt" o:hralign="center" o:hrstd="t" o:hr="t" fillcolor="#a0a0a0" stroked="f"/>
         </w:pict>
       </w:r>
     </w:p>
@@ -3166,7 +3167,6 @@
           <w:b/>
           <w:bCs/>
         </w:rPr>
-        <w:lastRenderedPageBreak/>
         <w:t>3. Summary of Highest Priority Systems for HAI-SCRIBE</w:t>
       </w:r>
     </w:p>
@@ -3253,9 +3253,3150 @@
         <w:t>These should be prioritised for early and continuous Infection Prevention &amp; Control (IPC) engagement.</w:t>
       </w:r>
     </w:p>
+    <w:p>
+      <w:r>
+        <w:rPr>
+          <w:b/>
+          <w:bCs/>
+        </w:rPr>
+        <w:lastRenderedPageBreak/>
+        <w:t>Coloured Heat Map – HAI-SCRIBE vs RIBA</w:t>
+      </w:r>
+      <w:r>
+        <w:t xml:space="preserve"> </w:t>
+      </w:r>
+      <w:r>
+        <w:rPr>
+          <w:b/>
+          <w:bCs/>
+        </w:rPr>
+        <w:t>17 Hard FM Systems</w:t>
+      </w:r>
+    </w:p>
+    <w:p>
+      <w:r>
+        <w:rPr>
+          <w:b/>
+          <w:bCs/>
+        </w:rPr>
+        <w:t>Colour Legend</w:t>
+      </w:r>
+      <w:r>
+        <w:t xml:space="preserve"> </w:t>
+      </w:r>
+      <w:r>
+        <w:rPr>
+          <w:rFonts w:ascii="Segoe UI Emoji" w:hAnsi="Segoe UI Emoji" w:cs="Segoe UI Emoji"/>
+        </w:rPr>
+        <w:t>🔴</w:t>
+      </w:r>
+      <w:r>
+        <w:t xml:space="preserve"> </w:t>
+      </w:r>
+      <w:r>
+        <w:rPr>
+          <w:b/>
+          <w:bCs/>
+        </w:rPr>
+        <w:t>High</w:t>
+      </w:r>
+      <w:r>
+        <w:t> </w:t>
+      </w:r>
+      <w:r>
+        <w:rPr>
+          <w:rFonts w:ascii="Segoe UI Emoji" w:hAnsi="Segoe UI Emoji" w:cs="Segoe UI Emoji"/>
+        </w:rPr>
+        <w:t>🟠</w:t>
+      </w:r>
+      <w:r>
+        <w:t xml:space="preserve"> </w:t>
+      </w:r>
+      <w:r>
+        <w:rPr>
+          <w:b/>
+          <w:bCs/>
+        </w:rPr>
+        <w:t>Medium</w:t>
+      </w:r>
+      <w:r>
+        <w:t> </w:t>
+      </w:r>
+      <w:r>
+        <w:rPr>
+          <w:rFonts w:ascii="Segoe UI Emoji" w:hAnsi="Segoe UI Emoji" w:cs="Segoe UI Emoji"/>
+        </w:rPr>
+        <w:t>🟢</w:t>
+      </w:r>
+      <w:r>
+        <w:t xml:space="preserve"> </w:t>
+      </w:r>
+      <w:r>
+        <w:rPr>
+          <w:b/>
+          <w:bCs/>
+        </w:rPr>
+        <w:t>Low</w:t>
+      </w:r>
+      <w:r>
+        <w:t> </w:t>
+      </w:r>
+      <w:r>
+        <w:rPr>
+          <w:rFonts w:ascii="Segoe UI Emoji" w:hAnsi="Segoe UI Emoji" w:cs="Segoe UI Emoji"/>
+        </w:rPr>
+        <w:t>⚪</w:t>
+      </w:r>
+      <w:r>
+        <w:t xml:space="preserve"> Not significant</w:t>
+      </w:r>
+    </w:p>
+    <w:tbl>
+      <w:tblPr>
+        <w:tblW w:w="0" w:type="auto"/>
+        <w:tblCellSpacing w:w="15" w:type="dxa"/>
+        <w:tblBorders>
+          <w:top w:val="single" w:sz="4" w:space="0" w:color="auto"/>
+          <w:left w:val="single" w:sz="4" w:space="0" w:color="auto"/>
+          <w:bottom w:val="single" w:sz="4" w:space="0" w:color="auto"/>
+          <w:right w:val="single" w:sz="4" w:space="0" w:color="auto"/>
+          <w:insideH w:val="single" w:sz="4" w:space="0" w:color="auto"/>
+          <w:insideV w:val="single" w:sz="4" w:space="0" w:color="auto"/>
+        </w:tblBorders>
+        <w:tblCellMar>
+          <w:top w:w="15" w:type="dxa"/>
+          <w:left w:w="15" w:type="dxa"/>
+          <w:bottom w:w="15" w:type="dxa"/>
+          <w:right w:w="15" w:type="dxa"/>
+        </w:tblCellMar>
+        <w:tblLook w:val="04A0" w:firstRow="1" w:lastRow="0" w:firstColumn="1" w:lastColumn="0" w:noHBand="0" w:noVBand="1"/>
+      </w:tblPr>
+      <w:tblGrid>
+        <w:gridCol w:w="474"/>
+        <w:gridCol w:w="3265"/>
+        <w:gridCol w:w="410"/>
+        <w:gridCol w:w="410"/>
+        <w:gridCol w:w="410"/>
+        <w:gridCol w:w="410"/>
+        <w:gridCol w:w="410"/>
+        <w:gridCol w:w="410"/>
+        <w:gridCol w:w="410"/>
+        <w:gridCol w:w="425"/>
+      </w:tblGrid>
+      <w:tr>
+        <w:trPr>
+          <w:tblHeader/>
+          <w:tblCellSpacing w:w="15" w:type="dxa"/>
+        </w:trPr>
+        <w:tc>
+          <w:tcPr>
+            <w:tcW w:w="0" w:type="auto"/>
+            <w:vAlign w:val="center"/>
+            <w:hideMark/>
+          </w:tcPr>
+          <w:p>
+            <w:pPr>
+              <w:rPr>
+                <w:b/>
+                <w:bCs/>
+              </w:rPr>
+            </w:pPr>
+            <w:r>
+              <w:rPr>
+                <w:b/>
+                <w:bCs/>
+              </w:rPr>
+              <w:t>No.</w:t>
+            </w:r>
+          </w:p>
+        </w:tc>
+        <w:tc>
+          <w:tcPr>
+            <w:tcW w:w="0" w:type="auto"/>
+            <w:vAlign w:val="center"/>
+            <w:hideMark/>
+          </w:tcPr>
+          <w:p>
+            <w:pPr>
+              <w:rPr>
+                <w:b/>
+                <w:bCs/>
+              </w:rPr>
+            </w:pPr>
+            <w:r>
+              <w:rPr>
+                <w:b/>
+                <w:bCs/>
+              </w:rPr>
+              <w:t>System</w:t>
+            </w:r>
+          </w:p>
+        </w:tc>
+        <w:tc>
+          <w:tcPr>
+            <w:tcW w:w="0" w:type="auto"/>
+            <w:vAlign w:val="center"/>
+            <w:hideMark/>
+          </w:tcPr>
+          <w:p>
+            <w:pPr>
+              <w:rPr>
+                <w:b/>
+                <w:bCs/>
+              </w:rPr>
+            </w:pPr>
+            <w:r>
+              <w:rPr>
+                <w:b/>
+                <w:bCs/>
+              </w:rPr>
+              <w:t>R0</w:t>
+            </w:r>
+          </w:p>
+        </w:tc>
+        <w:tc>
+          <w:tcPr>
+            <w:tcW w:w="0" w:type="auto"/>
+            <w:vAlign w:val="center"/>
+            <w:hideMark/>
+          </w:tcPr>
+          <w:p>
+            <w:pPr>
+              <w:rPr>
+                <w:b/>
+                <w:bCs/>
+              </w:rPr>
+            </w:pPr>
+            <w:r>
+              <w:rPr>
+                <w:b/>
+                <w:bCs/>
+              </w:rPr>
+              <w:t>R1</w:t>
+            </w:r>
+          </w:p>
+        </w:tc>
+        <w:tc>
+          <w:tcPr>
+            <w:tcW w:w="0" w:type="auto"/>
+            <w:vAlign w:val="center"/>
+            <w:hideMark/>
+          </w:tcPr>
+          <w:p>
+            <w:pPr>
+              <w:rPr>
+                <w:b/>
+                <w:bCs/>
+              </w:rPr>
+            </w:pPr>
+            <w:r>
+              <w:rPr>
+                <w:b/>
+                <w:bCs/>
+              </w:rPr>
+              <w:t>R2</w:t>
+            </w:r>
+          </w:p>
+        </w:tc>
+        <w:tc>
+          <w:tcPr>
+            <w:tcW w:w="0" w:type="auto"/>
+            <w:vAlign w:val="center"/>
+            <w:hideMark/>
+          </w:tcPr>
+          <w:p>
+            <w:pPr>
+              <w:rPr>
+                <w:b/>
+                <w:bCs/>
+              </w:rPr>
+            </w:pPr>
+            <w:r>
+              <w:rPr>
+                <w:b/>
+                <w:bCs/>
+              </w:rPr>
+              <w:t>R3</w:t>
+            </w:r>
+          </w:p>
+        </w:tc>
+        <w:tc>
+          <w:tcPr>
+            <w:tcW w:w="0" w:type="auto"/>
+            <w:vAlign w:val="center"/>
+            <w:hideMark/>
+          </w:tcPr>
+          <w:p>
+            <w:pPr>
+              <w:rPr>
+                <w:b/>
+                <w:bCs/>
+              </w:rPr>
+            </w:pPr>
+            <w:r>
+              <w:rPr>
+                <w:b/>
+                <w:bCs/>
+              </w:rPr>
+              <w:t>R4</w:t>
+            </w:r>
+          </w:p>
+        </w:tc>
+        <w:tc>
+          <w:tcPr>
+            <w:tcW w:w="0" w:type="auto"/>
+            <w:vAlign w:val="center"/>
+            <w:hideMark/>
+          </w:tcPr>
+          <w:p>
+            <w:pPr>
+              <w:rPr>
+                <w:b/>
+                <w:bCs/>
+              </w:rPr>
+            </w:pPr>
+            <w:r>
+              <w:rPr>
+                <w:b/>
+                <w:bCs/>
+              </w:rPr>
+              <w:t>R5</w:t>
+            </w:r>
+          </w:p>
+        </w:tc>
+        <w:tc>
+          <w:tcPr>
+            <w:tcW w:w="0" w:type="auto"/>
+            <w:vAlign w:val="center"/>
+            <w:hideMark/>
+          </w:tcPr>
+          <w:p>
+            <w:pPr>
+              <w:rPr>
+                <w:b/>
+                <w:bCs/>
+              </w:rPr>
+            </w:pPr>
+            <w:r>
+              <w:rPr>
+                <w:b/>
+                <w:bCs/>
+              </w:rPr>
+              <w:t>R6</w:t>
+            </w:r>
+          </w:p>
+        </w:tc>
+        <w:tc>
+          <w:tcPr>
+            <w:tcW w:w="0" w:type="auto"/>
+            <w:vAlign w:val="center"/>
+            <w:hideMark/>
+          </w:tcPr>
+          <w:p>
+            <w:pPr>
+              <w:rPr>
+                <w:b/>
+                <w:bCs/>
+              </w:rPr>
+            </w:pPr>
+            <w:r>
+              <w:rPr>
+                <w:b/>
+                <w:bCs/>
+              </w:rPr>
+              <w:t>R7</w:t>
+            </w:r>
+          </w:p>
+        </w:tc>
+      </w:tr>
+      <w:tr>
+        <w:trPr>
+          <w:tblCellSpacing w:w="15" w:type="dxa"/>
+        </w:trPr>
+        <w:tc>
+          <w:tcPr>
+            <w:tcW w:w="0" w:type="auto"/>
+            <w:vAlign w:val="center"/>
+            <w:hideMark/>
+          </w:tcPr>
+          <w:p>
+            <w:r>
+              <w:t>1</w:t>
+            </w:r>
+          </w:p>
+        </w:tc>
+        <w:tc>
+          <w:tcPr>
+            <w:tcW w:w="0" w:type="auto"/>
+            <w:vAlign w:val="center"/>
+            <w:hideMark/>
+          </w:tcPr>
+          <w:p>
+            <w:r>
+              <w:t>Valve / Boiler (LTHW)</w:t>
+            </w:r>
+          </w:p>
+        </w:tc>
+        <w:tc>
+          <w:tcPr>
+            <w:tcW w:w="0" w:type="auto"/>
+            <w:vAlign w:val="center"/>
+            <w:hideMark/>
+          </w:tcPr>
+          <w:p>
+            <w:r>
+              <w:rPr>
+                <w:rFonts w:ascii="Segoe UI Emoji" w:hAnsi="Segoe UI Emoji" w:cs="Segoe UI Emoji"/>
+              </w:rPr>
+              <w:t>🟢</w:t>
+            </w:r>
+          </w:p>
+        </w:tc>
+        <w:tc>
+          <w:tcPr>
+            <w:tcW w:w="0" w:type="auto"/>
+            <w:vAlign w:val="center"/>
+            <w:hideMark/>
+          </w:tcPr>
+          <w:p>
+            <w:r>
+              <w:rPr>
+                <w:rFonts w:ascii="Segoe UI Emoji" w:hAnsi="Segoe UI Emoji" w:cs="Segoe UI Emoji"/>
+              </w:rPr>
+              <w:t>🟠</w:t>
+            </w:r>
+          </w:p>
+        </w:tc>
+        <w:tc>
+          <w:tcPr>
+            <w:tcW w:w="0" w:type="auto"/>
+            <w:vAlign w:val="center"/>
+            <w:hideMark/>
+          </w:tcPr>
+          <w:p>
+            <w:r>
+              <w:rPr>
+                <w:rFonts w:ascii="Segoe UI Emoji" w:hAnsi="Segoe UI Emoji" w:cs="Segoe UI Emoji"/>
+              </w:rPr>
+              <w:t>🟠</w:t>
+            </w:r>
+          </w:p>
+        </w:tc>
+        <w:tc>
+          <w:tcPr>
+            <w:tcW w:w="0" w:type="auto"/>
+            <w:vAlign w:val="center"/>
+            <w:hideMark/>
+          </w:tcPr>
+          <w:p>
+            <w:r>
+              <w:rPr>
+                <w:rFonts w:ascii="Segoe UI Emoji" w:hAnsi="Segoe UI Emoji" w:cs="Segoe UI Emoji"/>
+              </w:rPr>
+              <w:t>🟠</w:t>
+            </w:r>
+          </w:p>
+        </w:tc>
+        <w:tc>
+          <w:tcPr>
+            <w:tcW w:w="0" w:type="auto"/>
+            <w:vAlign w:val="center"/>
+            <w:hideMark/>
+          </w:tcPr>
+          <w:p>
+            <w:r>
+              <w:rPr>
+                <w:rFonts w:ascii="Segoe UI Emoji" w:hAnsi="Segoe UI Emoji" w:cs="Segoe UI Emoji"/>
+              </w:rPr>
+              <w:t>🟠</w:t>
+            </w:r>
+          </w:p>
+        </w:tc>
+        <w:tc>
+          <w:tcPr>
+            <w:tcW w:w="0" w:type="auto"/>
+            <w:vAlign w:val="center"/>
+            <w:hideMark/>
+          </w:tcPr>
+          <w:p>
+            <w:r>
+              <w:rPr>
+                <w:rFonts w:ascii="Segoe UI Emoji" w:hAnsi="Segoe UI Emoji" w:cs="Segoe UI Emoji"/>
+              </w:rPr>
+              <w:t>🔴</w:t>
+            </w:r>
+          </w:p>
+        </w:tc>
+        <w:tc>
+          <w:tcPr>
+            <w:tcW w:w="0" w:type="auto"/>
+            <w:vAlign w:val="center"/>
+            <w:hideMark/>
+          </w:tcPr>
+          <w:p>
+            <w:r>
+              <w:rPr>
+                <w:rFonts w:ascii="Segoe UI Emoji" w:hAnsi="Segoe UI Emoji" w:cs="Segoe UI Emoji"/>
+              </w:rPr>
+              <w:t>🟠</w:t>
+            </w:r>
+          </w:p>
+        </w:tc>
+        <w:tc>
+          <w:tcPr>
+            <w:tcW w:w="0" w:type="auto"/>
+            <w:vAlign w:val="center"/>
+            <w:hideMark/>
+          </w:tcPr>
+          <w:p>
+            <w:r>
+              <w:rPr>
+                <w:rFonts w:ascii="Segoe UI Emoji" w:hAnsi="Segoe UI Emoji" w:cs="Segoe UI Emoji"/>
+              </w:rPr>
+              <w:t>🟠</w:t>
+            </w:r>
+          </w:p>
+        </w:tc>
+      </w:tr>
+      <w:tr>
+        <w:trPr>
+          <w:tblCellSpacing w:w="15" w:type="dxa"/>
+        </w:trPr>
+        <w:tc>
+          <w:tcPr>
+            <w:tcW w:w="0" w:type="auto"/>
+            <w:vAlign w:val="center"/>
+            <w:hideMark/>
+          </w:tcPr>
+          <w:p>
+            <w:r>
+              <w:t>2</w:t>
+            </w:r>
+          </w:p>
+        </w:tc>
+        <w:tc>
+          <w:tcPr>
+            <w:tcW w:w="0" w:type="auto"/>
+            <w:vAlign w:val="center"/>
+            <w:hideMark/>
+          </w:tcPr>
+          <w:p>
+            <w:r>
+              <w:t>Heating Systems</w:t>
+            </w:r>
+          </w:p>
+        </w:tc>
+        <w:tc>
+          <w:tcPr>
+            <w:tcW w:w="0" w:type="auto"/>
+            <w:vAlign w:val="center"/>
+            <w:hideMark/>
+          </w:tcPr>
+          <w:p>
+            <w:r>
+              <w:rPr>
+                <w:rFonts w:ascii="Segoe UI Emoji" w:hAnsi="Segoe UI Emoji" w:cs="Segoe UI Emoji"/>
+              </w:rPr>
+              <w:t>🟢</w:t>
+            </w:r>
+          </w:p>
+        </w:tc>
+        <w:tc>
+          <w:tcPr>
+            <w:tcW w:w="0" w:type="auto"/>
+            <w:vAlign w:val="center"/>
+            <w:hideMark/>
+          </w:tcPr>
+          <w:p>
+            <w:r>
+              <w:rPr>
+                <w:rFonts w:ascii="Segoe UI Emoji" w:hAnsi="Segoe UI Emoji" w:cs="Segoe UI Emoji"/>
+              </w:rPr>
+              <w:t>🟠</w:t>
+            </w:r>
+          </w:p>
+        </w:tc>
+        <w:tc>
+          <w:tcPr>
+            <w:tcW w:w="0" w:type="auto"/>
+            <w:vAlign w:val="center"/>
+            <w:hideMark/>
+          </w:tcPr>
+          <w:p>
+            <w:r>
+              <w:rPr>
+                <w:rFonts w:ascii="Segoe UI Emoji" w:hAnsi="Segoe UI Emoji" w:cs="Segoe UI Emoji"/>
+              </w:rPr>
+              <w:t>🟠</w:t>
+            </w:r>
+          </w:p>
+        </w:tc>
+        <w:tc>
+          <w:tcPr>
+            <w:tcW w:w="0" w:type="auto"/>
+            <w:vAlign w:val="center"/>
+            <w:hideMark/>
+          </w:tcPr>
+          <w:p>
+            <w:r>
+              <w:rPr>
+                <w:rFonts w:ascii="Segoe UI Emoji" w:hAnsi="Segoe UI Emoji" w:cs="Segoe UI Emoji"/>
+              </w:rPr>
+              <w:t>🟠</w:t>
+            </w:r>
+          </w:p>
+        </w:tc>
+        <w:tc>
+          <w:tcPr>
+            <w:tcW w:w="0" w:type="auto"/>
+            <w:vAlign w:val="center"/>
+            <w:hideMark/>
+          </w:tcPr>
+          <w:p>
+            <w:r>
+              <w:rPr>
+                <w:rFonts w:ascii="Segoe UI Emoji" w:hAnsi="Segoe UI Emoji" w:cs="Segoe UI Emoji"/>
+              </w:rPr>
+              <w:t>🟠</w:t>
+            </w:r>
+          </w:p>
+        </w:tc>
+        <w:tc>
+          <w:tcPr>
+            <w:tcW w:w="0" w:type="auto"/>
+            <w:vAlign w:val="center"/>
+            <w:hideMark/>
+          </w:tcPr>
+          <w:p>
+            <w:r>
+              <w:rPr>
+                <w:rFonts w:ascii="Segoe UI Emoji" w:hAnsi="Segoe UI Emoji" w:cs="Segoe UI Emoji"/>
+              </w:rPr>
+              <w:t>🔴</w:t>
+            </w:r>
+          </w:p>
+        </w:tc>
+        <w:tc>
+          <w:tcPr>
+            <w:tcW w:w="0" w:type="auto"/>
+            <w:vAlign w:val="center"/>
+            <w:hideMark/>
+          </w:tcPr>
+          <w:p>
+            <w:r>
+              <w:rPr>
+                <w:rFonts w:ascii="Segoe UI Emoji" w:hAnsi="Segoe UI Emoji" w:cs="Segoe UI Emoji"/>
+              </w:rPr>
+              <w:t>🟠</w:t>
+            </w:r>
+          </w:p>
+        </w:tc>
+        <w:tc>
+          <w:tcPr>
+            <w:tcW w:w="0" w:type="auto"/>
+            <w:vAlign w:val="center"/>
+            <w:hideMark/>
+          </w:tcPr>
+          <w:p>
+            <w:r>
+              <w:rPr>
+                <w:rFonts w:ascii="Segoe UI Emoji" w:hAnsi="Segoe UI Emoji" w:cs="Segoe UI Emoji"/>
+              </w:rPr>
+              <w:t>🟠</w:t>
+            </w:r>
+          </w:p>
+        </w:tc>
+      </w:tr>
+      <w:tr>
+        <w:trPr>
+          <w:tblCellSpacing w:w="15" w:type="dxa"/>
+        </w:trPr>
+        <w:tc>
+          <w:tcPr>
+            <w:tcW w:w="0" w:type="auto"/>
+            <w:vAlign w:val="center"/>
+            <w:hideMark/>
+          </w:tcPr>
+          <w:p>
+            <w:r>
+              <w:t>3</w:t>
+            </w:r>
+          </w:p>
+        </w:tc>
+        <w:tc>
+          <w:tcPr>
+            <w:tcW w:w="0" w:type="auto"/>
+            <w:vAlign w:val="center"/>
+            <w:hideMark/>
+          </w:tcPr>
+          <w:p>
+            <w:r>
+              <w:rPr>
+                <w:b/>
+                <w:bCs/>
+              </w:rPr>
+              <w:t>Ventilation Systems</w:t>
+            </w:r>
+          </w:p>
+        </w:tc>
+        <w:tc>
+          <w:tcPr>
+            <w:tcW w:w="0" w:type="auto"/>
+            <w:vAlign w:val="center"/>
+            <w:hideMark/>
+          </w:tcPr>
+          <w:p>
+            <w:r>
+              <w:rPr>
+                <w:rFonts w:ascii="Segoe UI Emoji" w:hAnsi="Segoe UI Emoji" w:cs="Segoe UI Emoji"/>
+              </w:rPr>
+              <w:t>🟠</w:t>
+            </w:r>
+          </w:p>
+        </w:tc>
+        <w:tc>
+          <w:tcPr>
+            <w:tcW w:w="0" w:type="auto"/>
+            <w:vAlign w:val="center"/>
+            <w:hideMark/>
+          </w:tcPr>
+          <w:p>
+            <w:r>
+              <w:rPr>
+                <w:rFonts w:ascii="Segoe UI Emoji" w:hAnsi="Segoe UI Emoji" w:cs="Segoe UI Emoji"/>
+              </w:rPr>
+              <w:t>🟠</w:t>
+            </w:r>
+          </w:p>
+        </w:tc>
+        <w:tc>
+          <w:tcPr>
+            <w:tcW w:w="0" w:type="auto"/>
+            <w:vAlign w:val="center"/>
+            <w:hideMark/>
+          </w:tcPr>
+          <w:p>
+            <w:r>
+              <w:rPr>
+                <w:rFonts w:ascii="Segoe UI Emoji" w:hAnsi="Segoe UI Emoji" w:cs="Segoe UI Emoji"/>
+              </w:rPr>
+              <w:t>🔴</w:t>
+            </w:r>
+          </w:p>
+        </w:tc>
+        <w:tc>
+          <w:tcPr>
+            <w:tcW w:w="0" w:type="auto"/>
+            <w:vAlign w:val="center"/>
+            <w:hideMark/>
+          </w:tcPr>
+          <w:p>
+            <w:r>
+              <w:rPr>
+                <w:rFonts w:ascii="Segoe UI Emoji" w:hAnsi="Segoe UI Emoji" w:cs="Segoe UI Emoji"/>
+              </w:rPr>
+              <w:t>🔴</w:t>
+            </w:r>
+          </w:p>
+        </w:tc>
+        <w:tc>
+          <w:tcPr>
+            <w:tcW w:w="0" w:type="auto"/>
+            <w:vAlign w:val="center"/>
+            <w:hideMark/>
+          </w:tcPr>
+          <w:p>
+            <w:r>
+              <w:rPr>
+                <w:rFonts w:ascii="Segoe UI Emoji" w:hAnsi="Segoe UI Emoji" w:cs="Segoe UI Emoji"/>
+              </w:rPr>
+              <w:t>🔴</w:t>
+            </w:r>
+          </w:p>
+        </w:tc>
+        <w:tc>
+          <w:tcPr>
+            <w:tcW w:w="0" w:type="auto"/>
+            <w:vAlign w:val="center"/>
+            <w:hideMark/>
+          </w:tcPr>
+          <w:p>
+            <w:r>
+              <w:rPr>
+                <w:rFonts w:ascii="Segoe UI Emoji" w:hAnsi="Segoe UI Emoji" w:cs="Segoe UI Emoji"/>
+              </w:rPr>
+              <w:t>🔴</w:t>
+            </w:r>
+          </w:p>
+        </w:tc>
+        <w:tc>
+          <w:tcPr>
+            <w:tcW w:w="0" w:type="auto"/>
+            <w:vAlign w:val="center"/>
+            <w:hideMark/>
+          </w:tcPr>
+          <w:p>
+            <w:r>
+              <w:rPr>
+                <w:rFonts w:ascii="Segoe UI Emoji" w:hAnsi="Segoe UI Emoji" w:cs="Segoe UI Emoji"/>
+              </w:rPr>
+              <w:t>🔴</w:t>
+            </w:r>
+          </w:p>
+        </w:tc>
+        <w:tc>
+          <w:tcPr>
+            <w:tcW w:w="0" w:type="auto"/>
+            <w:vAlign w:val="center"/>
+            <w:hideMark/>
+          </w:tcPr>
+          <w:p>
+            <w:r>
+              <w:rPr>
+                <w:rFonts w:ascii="Segoe UI Emoji" w:hAnsi="Segoe UI Emoji" w:cs="Segoe UI Emoji"/>
+              </w:rPr>
+              <w:t>🔴</w:t>
+            </w:r>
+          </w:p>
+        </w:tc>
+      </w:tr>
+      <w:tr>
+        <w:trPr>
+          <w:tblCellSpacing w:w="15" w:type="dxa"/>
+        </w:trPr>
+        <w:tc>
+          <w:tcPr>
+            <w:tcW w:w="0" w:type="auto"/>
+            <w:vAlign w:val="center"/>
+            <w:hideMark/>
+          </w:tcPr>
+          <w:p>
+            <w:r>
+              <w:t>4</w:t>
+            </w:r>
+          </w:p>
+        </w:tc>
+        <w:tc>
+          <w:tcPr>
+            <w:tcW w:w="0" w:type="auto"/>
+            <w:vAlign w:val="center"/>
+            <w:hideMark/>
+          </w:tcPr>
+          <w:p>
+            <w:r>
+              <w:rPr>
+                <w:b/>
+                <w:bCs/>
+              </w:rPr>
+              <w:t>Medical Gas Systems</w:t>
+            </w:r>
+          </w:p>
+        </w:tc>
+        <w:tc>
+          <w:tcPr>
+            <w:tcW w:w="0" w:type="auto"/>
+            <w:vAlign w:val="center"/>
+            <w:hideMark/>
+          </w:tcPr>
+          <w:p>
+            <w:r>
+              <w:rPr>
+                <w:rFonts w:ascii="Segoe UI Emoji" w:hAnsi="Segoe UI Emoji" w:cs="Segoe UI Emoji"/>
+              </w:rPr>
+              <w:t>🟠</w:t>
+            </w:r>
+          </w:p>
+        </w:tc>
+        <w:tc>
+          <w:tcPr>
+            <w:tcW w:w="0" w:type="auto"/>
+            <w:vAlign w:val="center"/>
+            <w:hideMark/>
+          </w:tcPr>
+          <w:p>
+            <w:r>
+              <w:rPr>
+                <w:rFonts w:ascii="Segoe UI Emoji" w:hAnsi="Segoe UI Emoji" w:cs="Segoe UI Emoji"/>
+              </w:rPr>
+              <w:t>🟠</w:t>
+            </w:r>
+          </w:p>
+        </w:tc>
+        <w:tc>
+          <w:tcPr>
+            <w:tcW w:w="0" w:type="auto"/>
+            <w:vAlign w:val="center"/>
+            <w:hideMark/>
+          </w:tcPr>
+          <w:p>
+            <w:r>
+              <w:rPr>
+                <w:rFonts w:ascii="Segoe UI Emoji" w:hAnsi="Segoe UI Emoji" w:cs="Segoe UI Emoji"/>
+              </w:rPr>
+              <w:t>🔴</w:t>
+            </w:r>
+          </w:p>
+        </w:tc>
+        <w:tc>
+          <w:tcPr>
+            <w:tcW w:w="0" w:type="auto"/>
+            <w:vAlign w:val="center"/>
+            <w:hideMark/>
+          </w:tcPr>
+          <w:p>
+            <w:r>
+              <w:rPr>
+                <w:rFonts w:ascii="Segoe UI Emoji" w:hAnsi="Segoe UI Emoji" w:cs="Segoe UI Emoji"/>
+              </w:rPr>
+              <w:t>🔴</w:t>
+            </w:r>
+          </w:p>
+        </w:tc>
+        <w:tc>
+          <w:tcPr>
+            <w:tcW w:w="0" w:type="auto"/>
+            <w:vAlign w:val="center"/>
+            <w:hideMark/>
+          </w:tcPr>
+          <w:p>
+            <w:r>
+              <w:rPr>
+                <w:rFonts w:ascii="Segoe UI Emoji" w:hAnsi="Segoe UI Emoji" w:cs="Segoe UI Emoji"/>
+              </w:rPr>
+              <w:t>🔴</w:t>
+            </w:r>
+          </w:p>
+        </w:tc>
+        <w:tc>
+          <w:tcPr>
+            <w:tcW w:w="0" w:type="auto"/>
+            <w:vAlign w:val="center"/>
+            <w:hideMark/>
+          </w:tcPr>
+          <w:p>
+            <w:r>
+              <w:rPr>
+                <w:rFonts w:ascii="Segoe UI Emoji" w:hAnsi="Segoe UI Emoji" w:cs="Segoe UI Emoji"/>
+              </w:rPr>
+              <w:t>🔴</w:t>
+            </w:r>
+          </w:p>
+        </w:tc>
+        <w:tc>
+          <w:tcPr>
+            <w:tcW w:w="0" w:type="auto"/>
+            <w:vAlign w:val="center"/>
+            <w:hideMark/>
+          </w:tcPr>
+          <w:p>
+            <w:r>
+              <w:rPr>
+                <w:rFonts w:ascii="Segoe UI Emoji" w:hAnsi="Segoe UI Emoji" w:cs="Segoe UI Emoji"/>
+              </w:rPr>
+              <w:t>🔴</w:t>
+            </w:r>
+          </w:p>
+        </w:tc>
+        <w:tc>
+          <w:tcPr>
+            <w:tcW w:w="0" w:type="auto"/>
+            <w:vAlign w:val="center"/>
+            <w:hideMark/>
+          </w:tcPr>
+          <w:p>
+            <w:r>
+              <w:rPr>
+                <w:rFonts w:ascii="Segoe UI Emoji" w:hAnsi="Segoe UI Emoji" w:cs="Segoe UI Emoji"/>
+              </w:rPr>
+              <w:t>🔴</w:t>
+            </w:r>
+          </w:p>
+        </w:tc>
+      </w:tr>
+      <w:tr>
+        <w:trPr>
+          <w:tblCellSpacing w:w="15" w:type="dxa"/>
+        </w:trPr>
+        <w:tc>
+          <w:tcPr>
+            <w:tcW w:w="0" w:type="auto"/>
+            <w:vAlign w:val="center"/>
+            <w:hideMark/>
+          </w:tcPr>
+          <w:p>
+            <w:r>
+              <w:t>5</w:t>
+            </w:r>
+          </w:p>
+        </w:tc>
+        <w:tc>
+          <w:tcPr>
+            <w:tcW w:w="0" w:type="auto"/>
+            <w:vAlign w:val="center"/>
+            <w:hideMark/>
+          </w:tcPr>
+          <w:p>
+            <w:r>
+              <w:t>Fire Detection &amp; Alarm</w:t>
+            </w:r>
+          </w:p>
+        </w:tc>
+        <w:tc>
+          <w:tcPr>
+            <w:tcW w:w="0" w:type="auto"/>
+            <w:vAlign w:val="center"/>
+            <w:hideMark/>
+          </w:tcPr>
+          <w:p>
+            <w:r>
+              <w:rPr>
+                <w:rFonts w:ascii="Segoe UI Emoji" w:hAnsi="Segoe UI Emoji" w:cs="Segoe UI Emoji"/>
+              </w:rPr>
+              <w:t>🟢</w:t>
+            </w:r>
+          </w:p>
+        </w:tc>
+        <w:tc>
+          <w:tcPr>
+            <w:tcW w:w="0" w:type="auto"/>
+            <w:vAlign w:val="center"/>
+            <w:hideMark/>
+          </w:tcPr>
+          <w:p>
+            <w:r>
+              <w:rPr>
+                <w:rFonts w:ascii="Segoe UI Emoji" w:hAnsi="Segoe UI Emoji" w:cs="Segoe UI Emoji"/>
+              </w:rPr>
+              <w:t>🟢</w:t>
+            </w:r>
+          </w:p>
+        </w:tc>
+        <w:tc>
+          <w:tcPr>
+            <w:tcW w:w="0" w:type="auto"/>
+            <w:vAlign w:val="center"/>
+            <w:hideMark/>
+          </w:tcPr>
+          <w:p>
+            <w:r>
+              <w:rPr>
+                <w:rFonts w:ascii="Segoe UI Emoji" w:hAnsi="Segoe UI Emoji" w:cs="Segoe UI Emoji"/>
+              </w:rPr>
+              <w:t>🟢</w:t>
+            </w:r>
+          </w:p>
+        </w:tc>
+        <w:tc>
+          <w:tcPr>
+            <w:tcW w:w="0" w:type="auto"/>
+            <w:vAlign w:val="center"/>
+            <w:hideMark/>
+          </w:tcPr>
+          <w:p>
+            <w:r>
+              <w:rPr>
+                <w:rFonts w:ascii="Segoe UI Emoji" w:hAnsi="Segoe UI Emoji" w:cs="Segoe UI Emoji"/>
+              </w:rPr>
+              <w:t>🟢</w:t>
+            </w:r>
+          </w:p>
+        </w:tc>
+        <w:tc>
+          <w:tcPr>
+            <w:tcW w:w="0" w:type="auto"/>
+            <w:vAlign w:val="center"/>
+            <w:hideMark/>
+          </w:tcPr>
+          <w:p>
+            <w:r>
+              <w:rPr>
+                <w:rFonts w:ascii="Segoe UI Emoji" w:hAnsi="Segoe UI Emoji" w:cs="Segoe UI Emoji"/>
+              </w:rPr>
+              <w:t>🟠</w:t>
+            </w:r>
+          </w:p>
+        </w:tc>
+        <w:tc>
+          <w:tcPr>
+            <w:tcW w:w="0" w:type="auto"/>
+            <w:vAlign w:val="center"/>
+            <w:hideMark/>
+          </w:tcPr>
+          <w:p>
+            <w:r>
+              <w:rPr>
+                <w:rFonts w:ascii="Segoe UI Emoji" w:hAnsi="Segoe UI Emoji" w:cs="Segoe UI Emoji"/>
+              </w:rPr>
+              <w:t>🟠</w:t>
+            </w:r>
+          </w:p>
+        </w:tc>
+        <w:tc>
+          <w:tcPr>
+            <w:tcW w:w="0" w:type="auto"/>
+            <w:vAlign w:val="center"/>
+            <w:hideMark/>
+          </w:tcPr>
+          <w:p>
+            <w:r>
+              <w:rPr>
+                <w:rFonts w:ascii="Segoe UI Emoji" w:hAnsi="Segoe UI Emoji" w:cs="Segoe UI Emoji"/>
+              </w:rPr>
+              <w:t>🟠</w:t>
+            </w:r>
+          </w:p>
+        </w:tc>
+        <w:tc>
+          <w:tcPr>
+            <w:tcW w:w="0" w:type="auto"/>
+            <w:vAlign w:val="center"/>
+            <w:hideMark/>
+          </w:tcPr>
+          <w:p>
+            <w:r>
+              <w:rPr>
+                <w:rFonts w:ascii="Segoe UI Emoji" w:hAnsi="Segoe UI Emoji" w:cs="Segoe UI Emoji"/>
+              </w:rPr>
+              <w:t>🟢</w:t>
+            </w:r>
+          </w:p>
+        </w:tc>
+      </w:tr>
+      <w:tr>
+        <w:trPr>
+          <w:tblCellSpacing w:w="15" w:type="dxa"/>
+        </w:trPr>
+        <w:tc>
+          <w:tcPr>
+            <w:tcW w:w="0" w:type="auto"/>
+            <w:vAlign w:val="center"/>
+            <w:hideMark/>
+          </w:tcPr>
+          <w:p>
+            <w:r>
+              <w:t>6</w:t>
+            </w:r>
+          </w:p>
+        </w:tc>
+        <w:tc>
+          <w:tcPr>
+            <w:tcW w:w="0" w:type="auto"/>
+            <w:vAlign w:val="center"/>
+            <w:hideMark/>
+          </w:tcPr>
+          <w:p>
+            <w:r>
+              <w:t>Lifts</w:t>
+            </w:r>
+          </w:p>
+        </w:tc>
+        <w:tc>
+          <w:tcPr>
+            <w:tcW w:w="0" w:type="auto"/>
+            <w:vAlign w:val="center"/>
+            <w:hideMark/>
+          </w:tcPr>
+          <w:p>
+            <w:r>
+              <w:rPr>
+                <w:rFonts w:ascii="Segoe UI Emoji" w:hAnsi="Segoe UI Emoji" w:cs="Segoe UI Emoji"/>
+              </w:rPr>
+              <w:t>🟢</w:t>
+            </w:r>
+          </w:p>
+        </w:tc>
+        <w:tc>
+          <w:tcPr>
+            <w:tcW w:w="0" w:type="auto"/>
+            <w:vAlign w:val="center"/>
+            <w:hideMark/>
+          </w:tcPr>
+          <w:p>
+            <w:r>
+              <w:rPr>
+                <w:rFonts w:ascii="Segoe UI Emoji" w:hAnsi="Segoe UI Emoji" w:cs="Segoe UI Emoji"/>
+              </w:rPr>
+              <w:t>🟢</w:t>
+            </w:r>
+          </w:p>
+        </w:tc>
+        <w:tc>
+          <w:tcPr>
+            <w:tcW w:w="0" w:type="auto"/>
+            <w:vAlign w:val="center"/>
+            <w:hideMark/>
+          </w:tcPr>
+          <w:p>
+            <w:r>
+              <w:rPr>
+                <w:rFonts w:ascii="Segoe UI Emoji" w:hAnsi="Segoe UI Emoji" w:cs="Segoe UI Emoji"/>
+              </w:rPr>
+              <w:t>🟠</w:t>
+            </w:r>
+          </w:p>
+        </w:tc>
+        <w:tc>
+          <w:tcPr>
+            <w:tcW w:w="0" w:type="auto"/>
+            <w:vAlign w:val="center"/>
+            <w:hideMark/>
+          </w:tcPr>
+          <w:p>
+            <w:r>
+              <w:rPr>
+                <w:rFonts w:ascii="Segoe UI Emoji" w:hAnsi="Segoe UI Emoji" w:cs="Segoe UI Emoji"/>
+              </w:rPr>
+              <w:t>🟠</w:t>
+            </w:r>
+          </w:p>
+        </w:tc>
+        <w:tc>
+          <w:tcPr>
+            <w:tcW w:w="0" w:type="auto"/>
+            <w:vAlign w:val="center"/>
+            <w:hideMark/>
+          </w:tcPr>
+          <w:p>
+            <w:r>
+              <w:rPr>
+                <w:rFonts w:ascii="Segoe UI Emoji" w:hAnsi="Segoe UI Emoji" w:cs="Segoe UI Emoji"/>
+              </w:rPr>
+              <w:t>🟠</w:t>
+            </w:r>
+          </w:p>
+        </w:tc>
+        <w:tc>
+          <w:tcPr>
+            <w:tcW w:w="0" w:type="auto"/>
+            <w:vAlign w:val="center"/>
+            <w:hideMark/>
+          </w:tcPr>
+          <w:p>
+            <w:r>
+              <w:rPr>
+                <w:rFonts w:ascii="Segoe UI Emoji" w:hAnsi="Segoe UI Emoji" w:cs="Segoe UI Emoji"/>
+              </w:rPr>
+              <w:t>🔴</w:t>
+            </w:r>
+          </w:p>
+        </w:tc>
+        <w:tc>
+          <w:tcPr>
+            <w:tcW w:w="0" w:type="auto"/>
+            <w:vAlign w:val="center"/>
+            <w:hideMark/>
+          </w:tcPr>
+          <w:p>
+            <w:r>
+              <w:rPr>
+                <w:rFonts w:ascii="Segoe UI Emoji" w:hAnsi="Segoe UI Emoji" w:cs="Segoe UI Emoji"/>
+              </w:rPr>
+              <w:t>🟠</w:t>
+            </w:r>
+          </w:p>
+        </w:tc>
+        <w:tc>
+          <w:tcPr>
+            <w:tcW w:w="0" w:type="auto"/>
+            <w:vAlign w:val="center"/>
+            <w:hideMark/>
+          </w:tcPr>
+          <w:p>
+            <w:r>
+              <w:rPr>
+                <w:rFonts w:ascii="Segoe UI Emoji" w:hAnsi="Segoe UI Emoji" w:cs="Segoe UI Emoji"/>
+              </w:rPr>
+              <w:t>🟢</w:t>
+            </w:r>
+          </w:p>
+        </w:tc>
+      </w:tr>
+      <w:tr>
+        <w:trPr>
+          <w:tblCellSpacing w:w="15" w:type="dxa"/>
+        </w:trPr>
+        <w:tc>
+          <w:tcPr>
+            <w:tcW w:w="0" w:type="auto"/>
+            <w:vAlign w:val="center"/>
+            <w:hideMark/>
+          </w:tcPr>
+          <w:p>
+            <w:r>
+              <w:t>7</w:t>
+            </w:r>
+          </w:p>
+        </w:tc>
+        <w:tc>
+          <w:tcPr>
+            <w:tcW w:w="0" w:type="auto"/>
+            <w:vAlign w:val="center"/>
+            <w:hideMark/>
+          </w:tcPr>
+          <w:p>
+            <w:r>
+              <w:t>Nurse Call &amp; Paging</w:t>
+            </w:r>
+          </w:p>
+        </w:tc>
+        <w:tc>
+          <w:tcPr>
+            <w:tcW w:w="0" w:type="auto"/>
+            <w:vAlign w:val="center"/>
+            <w:hideMark/>
+          </w:tcPr>
+          <w:p>
+            <w:r>
+              <w:rPr>
+                <w:rFonts w:ascii="Segoe UI Emoji" w:hAnsi="Segoe UI Emoji" w:cs="Segoe UI Emoji"/>
+              </w:rPr>
+              <w:t>🟢</w:t>
+            </w:r>
+          </w:p>
+        </w:tc>
+        <w:tc>
+          <w:tcPr>
+            <w:tcW w:w="0" w:type="auto"/>
+            <w:vAlign w:val="center"/>
+            <w:hideMark/>
+          </w:tcPr>
+          <w:p>
+            <w:r>
+              <w:rPr>
+                <w:rFonts w:ascii="Segoe UI Emoji" w:hAnsi="Segoe UI Emoji" w:cs="Segoe UI Emoji"/>
+              </w:rPr>
+              <w:t>🟢</w:t>
+            </w:r>
+          </w:p>
+        </w:tc>
+        <w:tc>
+          <w:tcPr>
+            <w:tcW w:w="0" w:type="auto"/>
+            <w:vAlign w:val="center"/>
+            <w:hideMark/>
+          </w:tcPr>
+          <w:p>
+            <w:r>
+              <w:rPr>
+                <w:rFonts w:ascii="Segoe UI Emoji" w:hAnsi="Segoe UI Emoji" w:cs="Segoe UI Emoji"/>
+              </w:rPr>
+              <w:t>🟢</w:t>
+            </w:r>
+          </w:p>
+        </w:tc>
+        <w:tc>
+          <w:tcPr>
+            <w:tcW w:w="0" w:type="auto"/>
+            <w:vAlign w:val="center"/>
+            <w:hideMark/>
+          </w:tcPr>
+          <w:p>
+            <w:r>
+              <w:rPr>
+                <w:rFonts w:ascii="Segoe UI Emoji" w:hAnsi="Segoe UI Emoji" w:cs="Segoe UI Emoji"/>
+              </w:rPr>
+              <w:t>🟢</w:t>
+            </w:r>
+          </w:p>
+        </w:tc>
+        <w:tc>
+          <w:tcPr>
+            <w:tcW w:w="0" w:type="auto"/>
+            <w:vAlign w:val="center"/>
+            <w:hideMark/>
+          </w:tcPr>
+          <w:p>
+            <w:r>
+              <w:rPr>
+                <w:rFonts w:ascii="Segoe UI Emoji" w:hAnsi="Segoe UI Emoji" w:cs="Segoe UI Emoji"/>
+              </w:rPr>
+              <w:t>🟠</w:t>
+            </w:r>
+          </w:p>
+        </w:tc>
+        <w:tc>
+          <w:tcPr>
+            <w:tcW w:w="0" w:type="auto"/>
+            <w:vAlign w:val="center"/>
+            <w:hideMark/>
+          </w:tcPr>
+          <w:p>
+            <w:r>
+              <w:rPr>
+                <w:rFonts w:ascii="Segoe UI Emoji" w:hAnsi="Segoe UI Emoji" w:cs="Segoe UI Emoji"/>
+              </w:rPr>
+              <w:t>🟠</w:t>
+            </w:r>
+          </w:p>
+        </w:tc>
+        <w:tc>
+          <w:tcPr>
+            <w:tcW w:w="0" w:type="auto"/>
+            <w:vAlign w:val="center"/>
+            <w:hideMark/>
+          </w:tcPr>
+          <w:p>
+            <w:r>
+              <w:rPr>
+                <w:rFonts w:ascii="Segoe UI Emoji" w:hAnsi="Segoe UI Emoji" w:cs="Segoe UI Emoji"/>
+              </w:rPr>
+              <w:t>🟠</w:t>
+            </w:r>
+          </w:p>
+        </w:tc>
+        <w:tc>
+          <w:tcPr>
+            <w:tcW w:w="0" w:type="auto"/>
+            <w:vAlign w:val="center"/>
+            <w:hideMark/>
+          </w:tcPr>
+          <w:p>
+            <w:r>
+              <w:rPr>
+                <w:rFonts w:ascii="Segoe UI Emoji" w:hAnsi="Segoe UI Emoji" w:cs="Segoe UI Emoji"/>
+              </w:rPr>
+              <w:t>🟢</w:t>
+            </w:r>
+          </w:p>
+        </w:tc>
+      </w:tr>
+      <w:tr>
+        <w:trPr>
+          <w:tblCellSpacing w:w="15" w:type="dxa"/>
+        </w:trPr>
+        <w:tc>
+          <w:tcPr>
+            <w:tcW w:w="0" w:type="auto"/>
+            <w:vAlign w:val="center"/>
+            <w:hideMark/>
+          </w:tcPr>
+          <w:p>
+            <w:r>
+              <w:t>8</w:t>
+            </w:r>
+          </w:p>
+        </w:tc>
+        <w:tc>
+          <w:tcPr>
+            <w:tcW w:w="0" w:type="auto"/>
+            <w:vAlign w:val="center"/>
+            <w:hideMark/>
+          </w:tcPr>
+          <w:p>
+            <w:r>
+              <w:t>Building Management System</w:t>
+            </w:r>
+          </w:p>
+        </w:tc>
+        <w:tc>
+          <w:tcPr>
+            <w:tcW w:w="0" w:type="auto"/>
+            <w:vAlign w:val="center"/>
+            <w:hideMark/>
+          </w:tcPr>
+          <w:p>
+            <w:r>
+              <w:rPr>
+                <w:rFonts w:ascii="Segoe UI Emoji" w:hAnsi="Segoe UI Emoji" w:cs="Segoe UI Emoji"/>
+              </w:rPr>
+              <w:t>🟢</w:t>
+            </w:r>
+          </w:p>
+        </w:tc>
+        <w:tc>
+          <w:tcPr>
+            <w:tcW w:w="0" w:type="auto"/>
+            <w:vAlign w:val="center"/>
+            <w:hideMark/>
+          </w:tcPr>
+          <w:p>
+            <w:r>
+              <w:rPr>
+                <w:rFonts w:ascii="Segoe UI Emoji" w:hAnsi="Segoe UI Emoji" w:cs="Segoe UI Emoji"/>
+              </w:rPr>
+              <w:t>🟢</w:t>
+            </w:r>
+          </w:p>
+        </w:tc>
+        <w:tc>
+          <w:tcPr>
+            <w:tcW w:w="0" w:type="auto"/>
+            <w:vAlign w:val="center"/>
+            <w:hideMark/>
+          </w:tcPr>
+          <w:p>
+            <w:r>
+              <w:rPr>
+                <w:rFonts w:ascii="Segoe UI Emoji" w:hAnsi="Segoe UI Emoji" w:cs="Segoe UI Emoji"/>
+              </w:rPr>
+              <w:t>🟠</w:t>
+            </w:r>
+          </w:p>
+        </w:tc>
+        <w:tc>
+          <w:tcPr>
+            <w:tcW w:w="0" w:type="auto"/>
+            <w:vAlign w:val="center"/>
+            <w:hideMark/>
+          </w:tcPr>
+          <w:p>
+            <w:r>
+              <w:rPr>
+                <w:rFonts w:ascii="Segoe UI Emoji" w:hAnsi="Segoe UI Emoji" w:cs="Segoe UI Emoji"/>
+              </w:rPr>
+              <w:t>🟠</w:t>
+            </w:r>
+          </w:p>
+        </w:tc>
+        <w:tc>
+          <w:tcPr>
+            <w:tcW w:w="0" w:type="auto"/>
+            <w:vAlign w:val="center"/>
+            <w:hideMark/>
+          </w:tcPr>
+          <w:p>
+            <w:r>
+              <w:rPr>
+                <w:rFonts w:ascii="Segoe UI Emoji" w:hAnsi="Segoe UI Emoji" w:cs="Segoe UI Emoji"/>
+              </w:rPr>
+              <w:t>🟠</w:t>
+            </w:r>
+          </w:p>
+        </w:tc>
+        <w:tc>
+          <w:tcPr>
+            <w:tcW w:w="0" w:type="auto"/>
+            <w:vAlign w:val="center"/>
+            <w:hideMark/>
+          </w:tcPr>
+          <w:p>
+            <w:r>
+              <w:rPr>
+                <w:rFonts w:ascii="Segoe UI Emoji" w:hAnsi="Segoe UI Emoji" w:cs="Segoe UI Emoji"/>
+              </w:rPr>
+              <w:t>🟠</w:t>
+            </w:r>
+          </w:p>
+        </w:tc>
+        <w:tc>
+          <w:tcPr>
+            <w:tcW w:w="0" w:type="auto"/>
+            <w:vAlign w:val="center"/>
+            <w:hideMark/>
+          </w:tcPr>
+          <w:p>
+            <w:r>
+              <w:rPr>
+                <w:rFonts w:ascii="Segoe UI Emoji" w:hAnsi="Segoe UI Emoji" w:cs="Segoe UI Emoji"/>
+              </w:rPr>
+              <w:t>🟠</w:t>
+            </w:r>
+          </w:p>
+        </w:tc>
+        <w:tc>
+          <w:tcPr>
+            <w:tcW w:w="0" w:type="auto"/>
+            <w:vAlign w:val="center"/>
+            <w:hideMark/>
+          </w:tcPr>
+          <w:p>
+            <w:r>
+              <w:rPr>
+                <w:rFonts w:ascii="Segoe UI Emoji" w:hAnsi="Segoe UI Emoji" w:cs="Segoe UI Emoji"/>
+              </w:rPr>
+              <w:t>🟢</w:t>
+            </w:r>
+          </w:p>
+        </w:tc>
+      </w:tr>
+      <w:tr>
+        <w:trPr>
+          <w:tblCellSpacing w:w="15" w:type="dxa"/>
+        </w:trPr>
+        <w:tc>
+          <w:tcPr>
+            <w:tcW w:w="0" w:type="auto"/>
+            <w:vAlign w:val="center"/>
+            <w:hideMark/>
+          </w:tcPr>
+          <w:p>
+            <w:r>
+              <w:t>9</w:t>
+            </w:r>
+          </w:p>
+        </w:tc>
+        <w:tc>
+          <w:tcPr>
+            <w:tcW w:w="0" w:type="auto"/>
+            <w:vAlign w:val="center"/>
+            <w:hideMark/>
+          </w:tcPr>
+          <w:p>
+            <w:r>
+              <w:t>Electrical Services</w:t>
+            </w:r>
+          </w:p>
+        </w:tc>
+        <w:tc>
+          <w:tcPr>
+            <w:tcW w:w="0" w:type="auto"/>
+            <w:vAlign w:val="center"/>
+            <w:hideMark/>
+          </w:tcPr>
+          <w:p>
+            <w:r>
+              <w:rPr>
+                <w:rFonts w:ascii="Segoe UI Emoji" w:hAnsi="Segoe UI Emoji" w:cs="Segoe UI Emoji"/>
+              </w:rPr>
+              <w:t>🟢</w:t>
+            </w:r>
+          </w:p>
+        </w:tc>
+        <w:tc>
+          <w:tcPr>
+            <w:tcW w:w="0" w:type="auto"/>
+            <w:vAlign w:val="center"/>
+            <w:hideMark/>
+          </w:tcPr>
+          <w:p>
+            <w:r>
+              <w:rPr>
+                <w:rFonts w:ascii="Segoe UI Emoji" w:hAnsi="Segoe UI Emoji" w:cs="Segoe UI Emoji"/>
+              </w:rPr>
+              <w:t>🟢</w:t>
+            </w:r>
+          </w:p>
+        </w:tc>
+        <w:tc>
+          <w:tcPr>
+            <w:tcW w:w="0" w:type="auto"/>
+            <w:vAlign w:val="center"/>
+            <w:hideMark/>
+          </w:tcPr>
+          <w:p>
+            <w:r>
+              <w:rPr>
+                <w:rFonts w:ascii="Segoe UI Emoji" w:hAnsi="Segoe UI Emoji" w:cs="Segoe UI Emoji"/>
+              </w:rPr>
+              <w:t>🟠</w:t>
+            </w:r>
+          </w:p>
+        </w:tc>
+        <w:tc>
+          <w:tcPr>
+            <w:tcW w:w="0" w:type="auto"/>
+            <w:vAlign w:val="center"/>
+            <w:hideMark/>
+          </w:tcPr>
+          <w:p>
+            <w:r>
+              <w:rPr>
+                <w:rFonts w:ascii="Segoe UI Emoji" w:hAnsi="Segoe UI Emoji" w:cs="Segoe UI Emoji"/>
+              </w:rPr>
+              <w:t>🟠</w:t>
+            </w:r>
+          </w:p>
+        </w:tc>
+        <w:tc>
+          <w:tcPr>
+            <w:tcW w:w="0" w:type="auto"/>
+            <w:vAlign w:val="center"/>
+            <w:hideMark/>
+          </w:tcPr>
+          <w:p>
+            <w:r>
+              <w:rPr>
+                <w:rFonts w:ascii="Segoe UI Emoji" w:hAnsi="Segoe UI Emoji" w:cs="Segoe UI Emoji"/>
+              </w:rPr>
+              <w:t>🟠</w:t>
+            </w:r>
+          </w:p>
+        </w:tc>
+        <w:tc>
+          <w:tcPr>
+            <w:tcW w:w="0" w:type="auto"/>
+            <w:vAlign w:val="center"/>
+            <w:hideMark/>
+          </w:tcPr>
+          <w:p>
+            <w:r>
+              <w:rPr>
+                <w:rFonts w:ascii="Segoe UI Emoji" w:hAnsi="Segoe UI Emoji" w:cs="Segoe UI Emoji"/>
+              </w:rPr>
+              <w:t>🔴</w:t>
+            </w:r>
+          </w:p>
+        </w:tc>
+        <w:tc>
+          <w:tcPr>
+            <w:tcW w:w="0" w:type="auto"/>
+            <w:vAlign w:val="center"/>
+            <w:hideMark/>
+          </w:tcPr>
+          <w:p>
+            <w:r>
+              <w:rPr>
+                <w:rFonts w:ascii="Segoe UI Emoji" w:hAnsi="Segoe UI Emoji" w:cs="Segoe UI Emoji"/>
+              </w:rPr>
+              <w:t>🟠</w:t>
+            </w:r>
+          </w:p>
+        </w:tc>
+        <w:tc>
+          <w:tcPr>
+            <w:tcW w:w="0" w:type="auto"/>
+            <w:vAlign w:val="center"/>
+            <w:hideMark/>
+          </w:tcPr>
+          <w:p>
+            <w:r>
+              <w:rPr>
+                <w:rFonts w:ascii="Segoe UI Emoji" w:hAnsi="Segoe UI Emoji" w:cs="Segoe UI Emoji"/>
+              </w:rPr>
+              <w:t>🟢</w:t>
+            </w:r>
+          </w:p>
+        </w:tc>
+      </w:tr>
+      <w:tr>
+        <w:trPr>
+          <w:tblCellSpacing w:w="15" w:type="dxa"/>
+        </w:trPr>
+        <w:tc>
+          <w:tcPr>
+            <w:tcW w:w="0" w:type="auto"/>
+            <w:vAlign w:val="center"/>
+            <w:hideMark/>
+          </w:tcPr>
+          <w:p>
+            <w:r>
+              <w:t>10</w:t>
+            </w:r>
+          </w:p>
+        </w:tc>
+        <w:tc>
+          <w:tcPr>
+            <w:tcW w:w="0" w:type="auto"/>
+            <w:vAlign w:val="center"/>
+            <w:hideMark/>
+          </w:tcPr>
+          <w:p>
+            <w:r>
+              <w:rPr>
+                <w:b/>
+                <w:bCs/>
+              </w:rPr>
+              <w:t>Domestic Hot &amp; Cold Water</w:t>
+            </w:r>
+          </w:p>
+        </w:tc>
+        <w:tc>
+          <w:tcPr>
+            <w:tcW w:w="0" w:type="auto"/>
+            <w:vAlign w:val="center"/>
+            <w:hideMark/>
+          </w:tcPr>
+          <w:p>
+            <w:r>
+              <w:rPr>
+                <w:rFonts w:ascii="Segoe UI Emoji" w:hAnsi="Segoe UI Emoji" w:cs="Segoe UI Emoji"/>
+              </w:rPr>
+              <w:t>🟠</w:t>
+            </w:r>
+          </w:p>
+        </w:tc>
+        <w:tc>
+          <w:tcPr>
+            <w:tcW w:w="0" w:type="auto"/>
+            <w:vAlign w:val="center"/>
+            <w:hideMark/>
+          </w:tcPr>
+          <w:p>
+            <w:r>
+              <w:rPr>
+                <w:rFonts w:ascii="Segoe UI Emoji" w:hAnsi="Segoe UI Emoji" w:cs="Segoe UI Emoji"/>
+              </w:rPr>
+              <w:t>🟠</w:t>
+            </w:r>
+          </w:p>
+        </w:tc>
+        <w:tc>
+          <w:tcPr>
+            <w:tcW w:w="0" w:type="auto"/>
+            <w:vAlign w:val="center"/>
+            <w:hideMark/>
+          </w:tcPr>
+          <w:p>
+            <w:r>
+              <w:rPr>
+                <w:rFonts w:ascii="Segoe UI Emoji" w:hAnsi="Segoe UI Emoji" w:cs="Segoe UI Emoji"/>
+              </w:rPr>
+              <w:t>🔴</w:t>
+            </w:r>
+          </w:p>
+        </w:tc>
+        <w:tc>
+          <w:tcPr>
+            <w:tcW w:w="0" w:type="auto"/>
+            <w:vAlign w:val="center"/>
+            <w:hideMark/>
+          </w:tcPr>
+          <w:p>
+            <w:r>
+              <w:rPr>
+                <w:rFonts w:ascii="Segoe UI Emoji" w:hAnsi="Segoe UI Emoji" w:cs="Segoe UI Emoji"/>
+              </w:rPr>
+              <w:t>🔴</w:t>
+            </w:r>
+          </w:p>
+        </w:tc>
+        <w:tc>
+          <w:tcPr>
+            <w:tcW w:w="0" w:type="auto"/>
+            <w:vAlign w:val="center"/>
+            <w:hideMark/>
+          </w:tcPr>
+          <w:p>
+            <w:r>
+              <w:rPr>
+                <w:rFonts w:ascii="Segoe UI Emoji" w:hAnsi="Segoe UI Emoji" w:cs="Segoe UI Emoji"/>
+              </w:rPr>
+              <w:t>🔴</w:t>
+            </w:r>
+          </w:p>
+        </w:tc>
+        <w:tc>
+          <w:tcPr>
+            <w:tcW w:w="0" w:type="auto"/>
+            <w:vAlign w:val="center"/>
+            <w:hideMark/>
+          </w:tcPr>
+          <w:p>
+            <w:r>
+              <w:rPr>
+                <w:rFonts w:ascii="Segoe UI Emoji" w:hAnsi="Segoe UI Emoji" w:cs="Segoe UI Emoji"/>
+              </w:rPr>
+              <w:t>🔴</w:t>
+            </w:r>
+          </w:p>
+        </w:tc>
+        <w:tc>
+          <w:tcPr>
+            <w:tcW w:w="0" w:type="auto"/>
+            <w:vAlign w:val="center"/>
+            <w:hideMark/>
+          </w:tcPr>
+          <w:p>
+            <w:r>
+              <w:rPr>
+                <w:rFonts w:ascii="Segoe UI Emoji" w:hAnsi="Segoe UI Emoji" w:cs="Segoe UI Emoji"/>
+              </w:rPr>
+              <w:t>🔴</w:t>
+            </w:r>
+          </w:p>
+        </w:tc>
+        <w:tc>
+          <w:tcPr>
+            <w:tcW w:w="0" w:type="auto"/>
+            <w:vAlign w:val="center"/>
+            <w:hideMark/>
+          </w:tcPr>
+          <w:p>
+            <w:r>
+              <w:rPr>
+                <w:rFonts w:ascii="Segoe UI Emoji" w:hAnsi="Segoe UI Emoji" w:cs="Segoe UI Emoji"/>
+              </w:rPr>
+              <w:t>🔴</w:t>
+            </w:r>
+          </w:p>
+        </w:tc>
+      </w:tr>
+      <w:tr>
+        <w:trPr>
+          <w:tblCellSpacing w:w="15" w:type="dxa"/>
+        </w:trPr>
+        <w:tc>
+          <w:tcPr>
+            <w:tcW w:w="0" w:type="auto"/>
+            <w:vAlign w:val="center"/>
+            <w:hideMark/>
+          </w:tcPr>
+          <w:p>
+            <w:r>
+              <w:t>11</w:t>
+            </w:r>
+          </w:p>
+        </w:tc>
+        <w:tc>
+          <w:tcPr>
+            <w:tcW w:w="0" w:type="auto"/>
+            <w:vAlign w:val="center"/>
+            <w:hideMark/>
+          </w:tcPr>
+          <w:p>
+            <w:r>
+              <w:rPr>
+                <w:b/>
+                <w:bCs/>
+              </w:rPr>
+              <w:t>Chilled Water / Cooling</w:t>
+            </w:r>
+          </w:p>
+        </w:tc>
+        <w:tc>
+          <w:tcPr>
+            <w:tcW w:w="0" w:type="auto"/>
+            <w:vAlign w:val="center"/>
+            <w:hideMark/>
+          </w:tcPr>
+          <w:p>
+            <w:r>
+              <w:rPr>
+                <w:rFonts w:ascii="Segoe UI Emoji" w:hAnsi="Segoe UI Emoji" w:cs="Segoe UI Emoji"/>
+              </w:rPr>
+              <w:t>🟠</w:t>
+            </w:r>
+          </w:p>
+        </w:tc>
+        <w:tc>
+          <w:tcPr>
+            <w:tcW w:w="0" w:type="auto"/>
+            <w:vAlign w:val="center"/>
+            <w:hideMark/>
+          </w:tcPr>
+          <w:p>
+            <w:r>
+              <w:rPr>
+                <w:rFonts w:ascii="Segoe UI Emoji" w:hAnsi="Segoe UI Emoji" w:cs="Segoe UI Emoji"/>
+              </w:rPr>
+              <w:t>🟠</w:t>
+            </w:r>
+          </w:p>
+        </w:tc>
+        <w:tc>
+          <w:tcPr>
+            <w:tcW w:w="0" w:type="auto"/>
+            <w:vAlign w:val="center"/>
+            <w:hideMark/>
+          </w:tcPr>
+          <w:p>
+            <w:r>
+              <w:rPr>
+                <w:rFonts w:ascii="Segoe UI Emoji" w:hAnsi="Segoe UI Emoji" w:cs="Segoe UI Emoji"/>
+              </w:rPr>
+              <w:t>🔴</w:t>
+            </w:r>
+          </w:p>
+        </w:tc>
+        <w:tc>
+          <w:tcPr>
+            <w:tcW w:w="0" w:type="auto"/>
+            <w:vAlign w:val="center"/>
+            <w:hideMark/>
+          </w:tcPr>
+          <w:p>
+            <w:r>
+              <w:rPr>
+                <w:rFonts w:ascii="Segoe UI Emoji" w:hAnsi="Segoe UI Emoji" w:cs="Segoe UI Emoji"/>
+              </w:rPr>
+              <w:t>🔴</w:t>
+            </w:r>
+          </w:p>
+        </w:tc>
+        <w:tc>
+          <w:tcPr>
+            <w:tcW w:w="0" w:type="auto"/>
+            <w:vAlign w:val="center"/>
+            <w:hideMark/>
+          </w:tcPr>
+          <w:p>
+            <w:r>
+              <w:rPr>
+                <w:rFonts w:ascii="Segoe UI Emoji" w:hAnsi="Segoe UI Emoji" w:cs="Segoe UI Emoji"/>
+              </w:rPr>
+              <w:t>🔴</w:t>
+            </w:r>
+          </w:p>
+        </w:tc>
+        <w:tc>
+          <w:tcPr>
+            <w:tcW w:w="0" w:type="auto"/>
+            <w:vAlign w:val="center"/>
+            <w:hideMark/>
+          </w:tcPr>
+          <w:p>
+            <w:r>
+              <w:rPr>
+                <w:rFonts w:ascii="Segoe UI Emoji" w:hAnsi="Segoe UI Emoji" w:cs="Segoe UI Emoji"/>
+              </w:rPr>
+              <w:t>🔴</w:t>
+            </w:r>
+          </w:p>
+        </w:tc>
+        <w:tc>
+          <w:tcPr>
+            <w:tcW w:w="0" w:type="auto"/>
+            <w:vAlign w:val="center"/>
+            <w:hideMark/>
+          </w:tcPr>
+          <w:p>
+            <w:r>
+              <w:rPr>
+                <w:rFonts w:ascii="Segoe UI Emoji" w:hAnsi="Segoe UI Emoji" w:cs="Segoe UI Emoji"/>
+              </w:rPr>
+              <w:t>🔴</w:t>
+            </w:r>
+          </w:p>
+        </w:tc>
+        <w:tc>
+          <w:tcPr>
+            <w:tcW w:w="0" w:type="auto"/>
+            <w:vAlign w:val="center"/>
+            <w:hideMark/>
+          </w:tcPr>
+          <w:p>
+            <w:r>
+              <w:rPr>
+                <w:rFonts w:ascii="Segoe UI Emoji" w:hAnsi="Segoe UI Emoji" w:cs="Segoe UI Emoji"/>
+              </w:rPr>
+              <w:t>🔴</w:t>
+            </w:r>
+          </w:p>
+        </w:tc>
+      </w:tr>
+      <w:tr>
+        <w:trPr>
+          <w:tblCellSpacing w:w="15" w:type="dxa"/>
+        </w:trPr>
+        <w:tc>
+          <w:tcPr>
+            <w:tcW w:w="0" w:type="auto"/>
+            <w:vAlign w:val="center"/>
+            <w:hideMark/>
+          </w:tcPr>
+          <w:p>
+            <w:r>
+              <w:t>12</w:t>
+            </w:r>
+          </w:p>
+        </w:tc>
+        <w:tc>
+          <w:tcPr>
+            <w:tcW w:w="0" w:type="auto"/>
+            <w:vAlign w:val="center"/>
+            <w:hideMark/>
+          </w:tcPr>
+          <w:p>
+            <w:r>
+              <w:t>Steam Systems</w:t>
+            </w:r>
+          </w:p>
+        </w:tc>
+        <w:tc>
+          <w:tcPr>
+            <w:tcW w:w="0" w:type="auto"/>
+            <w:vAlign w:val="center"/>
+            <w:hideMark/>
+          </w:tcPr>
+          <w:p>
+            <w:r>
+              <w:rPr>
+                <w:rFonts w:ascii="Segoe UI Emoji" w:hAnsi="Segoe UI Emoji" w:cs="Segoe UI Emoji"/>
+              </w:rPr>
+              <w:t>🟢</w:t>
+            </w:r>
+          </w:p>
+        </w:tc>
+        <w:tc>
+          <w:tcPr>
+            <w:tcW w:w="0" w:type="auto"/>
+            <w:vAlign w:val="center"/>
+            <w:hideMark/>
+          </w:tcPr>
+          <w:p>
+            <w:r>
+              <w:rPr>
+                <w:rFonts w:ascii="Segoe UI Emoji" w:hAnsi="Segoe UI Emoji" w:cs="Segoe UI Emoji"/>
+              </w:rPr>
+              <w:t>🟠</w:t>
+            </w:r>
+          </w:p>
+        </w:tc>
+        <w:tc>
+          <w:tcPr>
+            <w:tcW w:w="0" w:type="auto"/>
+            <w:vAlign w:val="center"/>
+            <w:hideMark/>
+          </w:tcPr>
+          <w:p>
+            <w:r>
+              <w:rPr>
+                <w:rFonts w:ascii="Segoe UI Emoji" w:hAnsi="Segoe UI Emoji" w:cs="Segoe UI Emoji"/>
+              </w:rPr>
+              <w:t>🟠</w:t>
+            </w:r>
+          </w:p>
+        </w:tc>
+        <w:tc>
+          <w:tcPr>
+            <w:tcW w:w="0" w:type="auto"/>
+            <w:vAlign w:val="center"/>
+            <w:hideMark/>
+          </w:tcPr>
+          <w:p>
+            <w:r>
+              <w:rPr>
+                <w:rFonts w:ascii="Segoe UI Emoji" w:hAnsi="Segoe UI Emoji" w:cs="Segoe UI Emoji"/>
+              </w:rPr>
+              <w:t>🟠</w:t>
+            </w:r>
+          </w:p>
+        </w:tc>
+        <w:tc>
+          <w:tcPr>
+            <w:tcW w:w="0" w:type="auto"/>
+            <w:vAlign w:val="center"/>
+            <w:hideMark/>
+          </w:tcPr>
+          <w:p>
+            <w:r>
+              <w:rPr>
+                <w:rFonts w:ascii="Segoe UI Emoji" w:hAnsi="Segoe UI Emoji" w:cs="Segoe UI Emoji"/>
+              </w:rPr>
+              <w:t>🟠</w:t>
+            </w:r>
+          </w:p>
+        </w:tc>
+        <w:tc>
+          <w:tcPr>
+            <w:tcW w:w="0" w:type="auto"/>
+            <w:vAlign w:val="center"/>
+            <w:hideMark/>
+          </w:tcPr>
+          <w:p>
+            <w:r>
+              <w:rPr>
+                <w:rFonts w:ascii="Segoe UI Emoji" w:hAnsi="Segoe UI Emoji" w:cs="Segoe UI Emoji"/>
+              </w:rPr>
+              <w:t>🔴</w:t>
+            </w:r>
+          </w:p>
+        </w:tc>
+        <w:tc>
+          <w:tcPr>
+            <w:tcW w:w="0" w:type="auto"/>
+            <w:vAlign w:val="center"/>
+            <w:hideMark/>
+          </w:tcPr>
+          <w:p>
+            <w:r>
+              <w:rPr>
+                <w:rFonts w:ascii="Segoe UI Emoji" w:hAnsi="Segoe UI Emoji" w:cs="Segoe UI Emoji"/>
+              </w:rPr>
+              <w:t>🟠</w:t>
+            </w:r>
+          </w:p>
+        </w:tc>
+        <w:tc>
+          <w:tcPr>
+            <w:tcW w:w="0" w:type="auto"/>
+            <w:vAlign w:val="center"/>
+            <w:hideMark/>
+          </w:tcPr>
+          <w:p>
+            <w:r>
+              <w:rPr>
+                <w:rFonts w:ascii="Segoe UI Emoji" w:hAnsi="Segoe UI Emoji" w:cs="Segoe UI Emoji"/>
+              </w:rPr>
+              <w:t>🟠</w:t>
+            </w:r>
+          </w:p>
+        </w:tc>
+      </w:tr>
+      <w:tr>
+        <w:trPr>
+          <w:tblCellSpacing w:w="15" w:type="dxa"/>
+        </w:trPr>
+        <w:tc>
+          <w:tcPr>
+            <w:tcW w:w="0" w:type="auto"/>
+            <w:vAlign w:val="center"/>
+            <w:hideMark/>
+          </w:tcPr>
+          <w:p>
+            <w:r>
+              <w:lastRenderedPageBreak/>
+              <w:t>13</w:t>
+            </w:r>
+          </w:p>
+        </w:tc>
+        <w:tc>
+          <w:tcPr>
+            <w:tcW w:w="0" w:type="auto"/>
+            <w:vAlign w:val="center"/>
+            <w:hideMark/>
+          </w:tcPr>
+          <w:p>
+            <w:r>
+              <w:t>Fire Suppression Systems</w:t>
+            </w:r>
+          </w:p>
+        </w:tc>
+        <w:tc>
+          <w:tcPr>
+            <w:tcW w:w="0" w:type="auto"/>
+            <w:vAlign w:val="center"/>
+            <w:hideMark/>
+          </w:tcPr>
+          <w:p>
+            <w:r>
+              <w:rPr>
+                <w:rFonts w:ascii="Segoe UI Emoji" w:hAnsi="Segoe UI Emoji" w:cs="Segoe UI Emoji"/>
+              </w:rPr>
+              <w:t>🟢</w:t>
+            </w:r>
+          </w:p>
+        </w:tc>
+        <w:tc>
+          <w:tcPr>
+            <w:tcW w:w="0" w:type="auto"/>
+            <w:vAlign w:val="center"/>
+            <w:hideMark/>
+          </w:tcPr>
+          <w:p>
+            <w:r>
+              <w:rPr>
+                <w:rFonts w:ascii="Segoe UI Emoji" w:hAnsi="Segoe UI Emoji" w:cs="Segoe UI Emoji"/>
+              </w:rPr>
+              <w:t>🟢</w:t>
+            </w:r>
+          </w:p>
+        </w:tc>
+        <w:tc>
+          <w:tcPr>
+            <w:tcW w:w="0" w:type="auto"/>
+            <w:vAlign w:val="center"/>
+            <w:hideMark/>
+          </w:tcPr>
+          <w:p>
+            <w:r>
+              <w:rPr>
+                <w:rFonts w:ascii="Segoe UI Emoji" w:hAnsi="Segoe UI Emoji" w:cs="Segoe UI Emoji"/>
+              </w:rPr>
+              <w:t>🟠</w:t>
+            </w:r>
+          </w:p>
+        </w:tc>
+        <w:tc>
+          <w:tcPr>
+            <w:tcW w:w="0" w:type="auto"/>
+            <w:vAlign w:val="center"/>
+            <w:hideMark/>
+          </w:tcPr>
+          <w:p>
+            <w:r>
+              <w:rPr>
+                <w:rFonts w:ascii="Segoe UI Emoji" w:hAnsi="Segoe UI Emoji" w:cs="Segoe UI Emoji"/>
+              </w:rPr>
+              <w:t>🟠</w:t>
+            </w:r>
+          </w:p>
+        </w:tc>
+        <w:tc>
+          <w:tcPr>
+            <w:tcW w:w="0" w:type="auto"/>
+            <w:vAlign w:val="center"/>
+            <w:hideMark/>
+          </w:tcPr>
+          <w:p>
+            <w:r>
+              <w:rPr>
+                <w:rFonts w:ascii="Segoe UI Emoji" w:hAnsi="Segoe UI Emoji" w:cs="Segoe UI Emoji"/>
+              </w:rPr>
+              <w:t>🟠</w:t>
+            </w:r>
+          </w:p>
+        </w:tc>
+        <w:tc>
+          <w:tcPr>
+            <w:tcW w:w="0" w:type="auto"/>
+            <w:vAlign w:val="center"/>
+            <w:hideMark/>
+          </w:tcPr>
+          <w:p>
+            <w:r>
+              <w:rPr>
+                <w:rFonts w:ascii="Segoe UI Emoji" w:hAnsi="Segoe UI Emoji" w:cs="Segoe UI Emoji"/>
+              </w:rPr>
+              <w:t>🔴</w:t>
+            </w:r>
+          </w:p>
+        </w:tc>
+        <w:tc>
+          <w:tcPr>
+            <w:tcW w:w="0" w:type="auto"/>
+            <w:vAlign w:val="center"/>
+            <w:hideMark/>
+          </w:tcPr>
+          <w:p>
+            <w:r>
+              <w:rPr>
+                <w:rFonts w:ascii="Segoe UI Emoji" w:hAnsi="Segoe UI Emoji" w:cs="Segoe UI Emoji"/>
+              </w:rPr>
+              <w:t>🟠</w:t>
+            </w:r>
+          </w:p>
+        </w:tc>
+        <w:tc>
+          <w:tcPr>
+            <w:tcW w:w="0" w:type="auto"/>
+            <w:vAlign w:val="center"/>
+            <w:hideMark/>
+          </w:tcPr>
+          <w:p>
+            <w:r>
+              <w:rPr>
+                <w:rFonts w:ascii="Segoe UI Emoji" w:hAnsi="Segoe UI Emoji" w:cs="Segoe UI Emoji"/>
+              </w:rPr>
+              <w:t>🟢</w:t>
+            </w:r>
+          </w:p>
+        </w:tc>
+      </w:tr>
+      <w:tr>
+        <w:trPr>
+          <w:tblCellSpacing w:w="15" w:type="dxa"/>
+        </w:trPr>
+        <w:tc>
+          <w:tcPr>
+            <w:tcW w:w="0" w:type="auto"/>
+            <w:vAlign w:val="center"/>
+            <w:hideMark/>
+          </w:tcPr>
+          <w:p>
+            <w:r>
+              <w:t>14</w:t>
+            </w:r>
+          </w:p>
+        </w:tc>
+        <w:tc>
+          <w:tcPr>
+            <w:tcW w:w="0" w:type="auto"/>
+            <w:vAlign w:val="center"/>
+            <w:hideMark/>
+          </w:tcPr>
+          <w:p>
+            <w:r>
+              <w:t>Security Systems</w:t>
+            </w:r>
+          </w:p>
+        </w:tc>
+        <w:tc>
+          <w:tcPr>
+            <w:tcW w:w="0" w:type="auto"/>
+            <w:vAlign w:val="center"/>
+            <w:hideMark/>
+          </w:tcPr>
+          <w:p>
+            <w:r>
+              <w:rPr>
+                <w:rFonts w:ascii="Segoe UI Emoji" w:hAnsi="Segoe UI Emoji" w:cs="Segoe UI Emoji"/>
+              </w:rPr>
+              <w:t>🟢</w:t>
+            </w:r>
+          </w:p>
+        </w:tc>
+        <w:tc>
+          <w:tcPr>
+            <w:tcW w:w="0" w:type="auto"/>
+            <w:vAlign w:val="center"/>
+            <w:hideMark/>
+          </w:tcPr>
+          <w:p>
+            <w:r>
+              <w:rPr>
+                <w:rFonts w:ascii="Segoe UI Emoji" w:hAnsi="Segoe UI Emoji" w:cs="Segoe UI Emoji"/>
+              </w:rPr>
+              <w:t>🟢</w:t>
+            </w:r>
+          </w:p>
+        </w:tc>
+        <w:tc>
+          <w:tcPr>
+            <w:tcW w:w="0" w:type="auto"/>
+            <w:vAlign w:val="center"/>
+            <w:hideMark/>
+          </w:tcPr>
+          <w:p>
+            <w:r>
+              <w:rPr>
+                <w:rFonts w:ascii="Segoe UI Emoji" w:hAnsi="Segoe UI Emoji" w:cs="Segoe UI Emoji"/>
+              </w:rPr>
+              <w:t>🟢</w:t>
+            </w:r>
+          </w:p>
+        </w:tc>
+        <w:tc>
+          <w:tcPr>
+            <w:tcW w:w="0" w:type="auto"/>
+            <w:vAlign w:val="center"/>
+            <w:hideMark/>
+          </w:tcPr>
+          <w:p>
+            <w:r>
+              <w:rPr>
+                <w:rFonts w:ascii="Segoe UI Emoji" w:hAnsi="Segoe UI Emoji" w:cs="Segoe UI Emoji"/>
+              </w:rPr>
+              <w:t>🟢</w:t>
+            </w:r>
+          </w:p>
+        </w:tc>
+        <w:tc>
+          <w:tcPr>
+            <w:tcW w:w="0" w:type="auto"/>
+            <w:vAlign w:val="center"/>
+            <w:hideMark/>
+          </w:tcPr>
+          <w:p>
+            <w:r>
+              <w:rPr>
+                <w:rFonts w:ascii="Segoe UI Emoji" w:hAnsi="Segoe UI Emoji" w:cs="Segoe UI Emoji"/>
+              </w:rPr>
+              <w:t>🟠</w:t>
+            </w:r>
+          </w:p>
+        </w:tc>
+        <w:tc>
+          <w:tcPr>
+            <w:tcW w:w="0" w:type="auto"/>
+            <w:vAlign w:val="center"/>
+            <w:hideMark/>
+          </w:tcPr>
+          <w:p>
+            <w:r>
+              <w:rPr>
+                <w:rFonts w:ascii="Segoe UI Emoji" w:hAnsi="Segoe UI Emoji" w:cs="Segoe UI Emoji"/>
+              </w:rPr>
+              <w:t>🟠</w:t>
+            </w:r>
+          </w:p>
+        </w:tc>
+        <w:tc>
+          <w:tcPr>
+            <w:tcW w:w="0" w:type="auto"/>
+            <w:vAlign w:val="center"/>
+            <w:hideMark/>
+          </w:tcPr>
+          <w:p>
+            <w:r>
+              <w:rPr>
+                <w:rFonts w:ascii="Segoe UI Emoji" w:hAnsi="Segoe UI Emoji" w:cs="Segoe UI Emoji"/>
+              </w:rPr>
+              <w:t>🟠</w:t>
+            </w:r>
+          </w:p>
+        </w:tc>
+        <w:tc>
+          <w:tcPr>
+            <w:tcW w:w="0" w:type="auto"/>
+            <w:vAlign w:val="center"/>
+            <w:hideMark/>
+          </w:tcPr>
+          <w:p>
+            <w:r>
+              <w:rPr>
+                <w:rFonts w:ascii="Segoe UI Emoji" w:hAnsi="Segoe UI Emoji" w:cs="Segoe UI Emoji"/>
+              </w:rPr>
+              <w:t>🟢</w:t>
+            </w:r>
+          </w:p>
+        </w:tc>
+      </w:tr>
+      <w:tr>
+        <w:trPr>
+          <w:tblCellSpacing w:w="15" w:type="dxa"/>
+        </w:trPr>
+        <w:tc>
+          <w:tcPr>
+            <w:tcW w:w="0" w:type="auto"/>
+            <w:vAlign w:val="center"/>
+            <w:hideMark/>
+          </w:tcPr>
+          <w:p>
+            <w:r>
+              <w:t>15</w:t>
+            </w:r>
+          </w:p>
+        </w:tc>
+        <w:tc>
+          <w:tcPr>
+            <w:tcW w:w="0" w:type="auto"/>
+            <w:vAlign w:val="center"/>
+            <w:hideMark/>
+          </w:tcPr>
+          <w:p>
+            <w:r>
+              <w:t>Pneumatic Tube Systems</w:t>
+            </w:r>
+          </w:p>
+        </w:tc>
+        <w:tc>
+          <w:tcPr>
+            <w:tcW w:w="0" w:type="auto"/>
+            <w:vAlign w:val="center"/>
+            <w:hideMark/>
+          </w:tcPr>
+          <w:p>
+            <w:r>
+              <w:rPr>
+                <w:rFonts w:ascii="Segoe UI Emoji" w:hAnsi="Segoe UI Emoji" w:cs="Segoe UI Emoji"/>
+              </w:rPr>
+              <w:t>🟢</w:t>
+            </w:r>
+          </w:p>
+        </w:tc>
+        <w:tc>
+          <w:tcPr>
+            <w:tcW w:w="0" w:type="auto"/>
+            <w:vAlign w:val="center"/>
+            <w:hideMark/>
+          </w:tcPr>
+          <w:p>
+            <w:r>
+              <w:rPr>
+                <w:rFonts w:ascii="Segoe UI Emoji" w:hAnsi="Segoe UI Emoji" w:cs="Segoe UI Emoji"/>
+              </w:rPr>
+              <w:t>🟠</w:t>
+            </w:r>
+          </w:p>
+        </w:tc>
+        <w:tc>
+          <w:tcPr>
+            <w:tcW w:w="0" w:type="auto"/>
+            <w:vAlign w:val="center"/>
+            <w:hideMark/>
+          </w:tcPr>
+          <w:p>
+            <w:r>
+              <w:rPr>
+                <w:rFonts w:ascii="Segoe UI Emoji" w:hAnsi="Segoe UI Emoji" w:cs="Segoe UI Emoji"/>
+              </w:rPr>
+              <w:t>🟠</w:t>
+            </w:r>
+          </w:p>
+        </w:tc>
+        <w:tc>
+          <w:tcPr>
+            <w:tcW w:w="0" w:type="auto"/>
+            <w:vAlign w:val="center"/>
+            <w:hideMark/>
+          </w:tcPr>
+          <w:p>
+            <w:r>
+              <w:rPr>
+                <w:rFonts w:ascii="Segoe UI Emoji" w:hAnsi="Segoe UI Emoji" w:cs="Segoe UI Emoji"/>
+              </w:rPr>
+              <w:t>🟠</w:t>
+            </w:r>
+          </w:p>
+        </w:tc>
+        <w:tc>
+          <w:tcPr>
+            <w:tcW w:w="0" w:type="auto"/>
+            <w:vAlign w:val="center"/>
+            <w:hideMark/>
+          </w:tcPr>
+          <w:p>
+            <w:r>
+              <w:rPr>
+                <w:rFonts w:ascii="Segoe UI Emoji" w:hAnsi="Segoe UI Emoji" w:cs="Segoe UI Emoji"/>
+              </w:rPr>
+              <w:t>🟠</w:t>
+            </w:r>
+          </w:p>
+        </w:tc>
+        <w:tc>
+          <w:tcPr>
+            <w:tcW w:w="0" w:type="auto"/>
+            <w:vAlign w:val="center"/>
+            <w:hideMark/>
+          </w:tcPr>
+          <w:p>
+            <w:r>
+              <w:rPr>
+                <w:rFonts w:ascii="Segoe UI Emoji" w:hAnsi="Segoe UI Emoji" w:cs="Segoe UI Emoji"/>
+              </w:rPr>
+              <w:t>🔴</w:t>
+            </w:r>
+          </w:p>
+        </w:tc>
+        <w:tc>
+          <w:tcPr>
+            <w:tcW w:w="0" w:type="auto"/>
+            <w:vAlign w:val="center"/>
+            <w:hideMark/>
+          </w:tcPr>
+          <w:p>
+            <w:r>
+              <w:rPr>
+                <w:rFonts w:ascii="Segoe UI Emoji" w:hAnsi="Segoe UI Emoji" w:cs="Segoe UI Emoji"/>
+              </w:rPr>
+              <w:t>🟠</w:t>
+            </w:r>
+          </w:p>
+        </w:tc>
+        <w:tc>
+          <w:tcPr>
+            <w:tcW w:w="0" w:type="auto"/>
+            <w:vAlign w:val="center"/>
+            <w:hideMark/>
+          </w:tcPr>
+          <w:p>
+            <w:r>
+              <w:rPr>
+                <w:rFonts w:ascii="Segoe UI Emoji" w:hAnsi="Segoe UI Emoji" w:cs="Segoe UI Emoji"/>
+              </w:rPr>
+              <w:t>🟢</w:t>
+            </w:r>
+          </w:p>
+        </w:tc>
+      </w:tr>
+      <w:tr>
+        <w:trPr>
+          <w:tblCellSpacing w:w="15" w:type="dxa"/>
+        </w:trPr>
+        <w:tc>
+          <w:tcPr>
+            <w:tcW w:w="0" w:type="auto"/>
+            <w:vAlign w:val="center"/>
+            <w:hideMark/>
+          </w:tcPr>
+          <w:p>
+            <w:r>
+              <w:t>16</w:t>
+            </w:r>
+          </w:p>
+        </w:tc>
+        <w:tc>
+          <w:tcPr>
+            <w:tcW w:w="0" w:type="auto"/>
+            <w:vAlign w:val="center"/>
+            <w:hideMark/>
+          </w:tcPr>
+          <w:p>
+            <w:r>
+              <w:rPr>
+                <w:b/>
+                <w:bCs/>
+              </w:rPr>
+              <w:t>Above-ground Drainage</w:t>
+            </w:r>
+          </w:p>
+        </w:tc>
+        <w:tc>
+          <w:tcPr>
+            <w:tcW w:w="0" w:type="auto"/>
+            <w:vAlign w:val="center"/>
+            <w:hideMark/>
+          </w:tcPr>
+          <w:p>
+            <w:r>
+              <w:rPr>
+                <w:rFonts w:ascii="Segoe UI Emoji" w:hAnsi="Segoe UI Emoji" w:cs="Segoe UI Emoji"/>
+              </w:rPr>
+              <w:t>🟠</w:t>
+            </w:r>
+          </w:p>
+        </w:tc>
+        <w:tc>
+          <w:tcPr>
+            <w:tcW w:w="0" w:type="auto"/>
+            <w:vAlign w:val="center"/>
+            <w:hideMark/>
+          </w:tcPr>
+          <w:p>
+            <w:r>
+              <w:rPr>
+                <w:rFonts w:ascii="Segoe UI Emoji" w:hAnsi="Segoe UI Emoji" w:cs="Segoe UI Emoji"/>
+              </w:rPr>
+              <w:t>🟠</w:t>
+            </w:r>
+          </w:p>
+        </w:tc>
+        <w:tc>
+          <w:tcPr>
+            <w:tcW w:w="0" w:type="auto"/>
+            <w:vAlign w:val="center"/>
+            <w:hideMark/>
+          </w:tcPr>
+          <w:p>
+            <w:r>
+              <w:rPr>
+                <w:rFonts w:ascii="Segoe UI Emoji" w:hAnsi="Segoe UI Emoji" w:cs="Segoe UI Emoji"/>
+              </w:rPr>
+              <w:t>🔴</w:t>
+            </w:r>
+          </w:p>
+        </w:tc>
+        <w:tc>
+          <w:tcPr>
+            <w:tcW w:w="0" w:type="auto"/>
+            <w:vAlign w:val="center"/>
+            <w:hideMark/>
+          </w:tcPr>
+          <w:p>
+            <w:r>
+              <w:rPr>
+                <w:rFonts w:ascii="Segoe UI Emoji" w:hAnsi="Segoe UI Emoji" w:cs="Segoe UI Emoji"/>
+              </w:rPr>
+              <w:t>🔴</w:t>
+            </w:r>
+          </w:p>
+        </w:tc>
+        <w:tc>
+          <w:tcPr>
+            <w:tcW w:w="0" w:type="auto"/>
+            <w:vAlign w:val="center"/>
+            <w:hideMark/>
+          </w:tcPr>
+          <w:p>
+            <w:r>
+              <w:rPr>
+                <w:rFonts w:ascii="Segoe UI Emoji" w:hAnsi="Segoe UI Emoji" w:cs="Segoe UI Emoji"/>
+              </w:rPr>
+              <w:t>🔴</w:t>
+            </w:r>
+          </w:p>
+        </w:tc>
+        <w:tc>
+          <w:tcPr>
+            <w:tcW w:w="0" w:type="auto"/>
+            <w:vAlign w:val="center"/>
+            <w:hideMark/>
+          </w:tcPr>
+          <w:p>
+            <w:r>
+              <w:rPr>
+                <w:rFonts w:ascii="Segoe UI Emoji" w:hAnsi="Segoe UI Emoji" w:cs="Segoe UI Emoji"/>
+              </w:rPr>
+              <w:t>🔴</w:t>
+            </w:r>
+          </w:p>
+        </w:tc>
+        <w:tc>
+          <w:tcPr>
+            <w:tcW w:w="0" w:type="auto"/>
+            <w:vAlign w:val="center"/>
+            <w:hideMark/>
+          </w:tcPr>
+          <w:p>
+            <w:r>
+              <w:rPr>
+                <w:rFonts w:ascii="Segoe UI Emoji" w:hAnsi="Segoe UI Emoji" w:cs="Segoe UI Emoji"/>
+              </w:rPr>
+              <w:t>🔴</w:t>
+            </w:r>
+          </w:p>
+        </w:tc>
+        <w:tc>
+          <w:tcPr>
+            <w:tcW w:w="0" w:type="auto"/>
+            <w:vAlign w:val="center"/>
+            <w:hideMark/>
+          </w:tcPr>
+          <w:p>
+            <w:r>
+              <w:rPr>
+                <w:rFonts w:ascii="Segoe UI Emoji" w:hAnsi="Segoe UI Emoji" w:cs="Segoe UI Emoji"/>
+              </w:rPr>
+              <w:t>🔴</w:t>
+            </w:r>
+          </w:p>
+        </w:tc>
+      </w:tr>
+      <w:tr>
+        <w:trPr>
+          <w:tblCellSpacing w:w="15" w:type="dxa"/>
+        </w:trPr>
+        <w:tc>
+          <w:tcPr>
+            <w:tcW w:w="0" w:type="auto"/>
+            <w:vAlign w:val="center"/>
+            <w:hideMark/>
+          </w:tcPr>
+          <w:p>
+            <w:r>
+              <w:t>17</w:t>
+            </w:r>
+          </w:p>
+        </w:tc>
+        <w:tc>
+          <w:tcPr>
+            <w:tcW w:w="0" w:type="auto"/>
+            <w:vAlign w:val="center"/>
+            <w:hideMark/>
+          </w:tcPr>
+          <w:p>
+            <w:r>
+              <w:t>Compressed Air (Non-Medical)</w:t>
+            </w:r>
+          </w:p>
+        </w:tc>
+        <w:tc>
+          <w:tcPr>
+            <w:tcW w:w="0" w:type="auto"/>
+            <w:vAlign w:val="center"/>
+            <w:hideMark/>
+          </w:tcPr>
+          <w:p>
+            <w:r>
+              <w:rPr>
+                <w:rFonts w:ascii="Segoe UI Emoji" w:hAnsi="Segoe UI Emoji" w:cs="Segoe UI Emoji"/>
+              </w:rPr>
+              <w:t>🟢</w:t>
+            </w:r>
+          </w:p>
+        </w:tc>
+        <w:tc>
+          <w:tcPr>
+            <w:tcW w:w="0" w:type="auto"/>
+            <w:vAlign w:val="center"/>
+            <w:hideMark/>
+          </w:tcPr>
+          <w:p>
+            <w:r>
+              <w:rPr>
+                <w:rFonts w:ascii="Segoe UI Emoji" w:hAnsi="Segoe UI Emoji" w:cs="Segoe UI Emoji"/>
+              </w:rPr>
+              <w:t>🟢</w:t>
+            </w:r>
+          </w:p>
+        </w:tc>
+        <w:tc>
+          <w:tcPr>
+            <w:tcW w:w="0" w:type="auto"/>
+            <w:vAlign w:val="center"/>
+            <w:hideMark/>
+          </w:tcPr>
+          <w:p>
+            <w:r>
+              <w:rPr>
+                <w:rFonts w:ascii="Segoe UI Emoji" w:hAnsi="Segoe UI Emoji" w:cs="Segoe UI Emoji"/>
+              </w:rPr>
+              <w:t>🟢</w:t>
+            </w:r>
+          </w:p>
+        </w:tc>
+        <w:tc>
+          <w:tcPr>
+            <w:tcW w:w="0" w:type="auto"/>
+            <w:vAlign w:val="center"/>
+            <w:hideMark/>
+          </w:tcPr>
+          <w:p>
+            <w:r>
+              <w:rPr>
+                <w:rFonts w:ascii="Segoe UI Emoji" w:hAnsi="Segoe UI Emoji" w:cs="Segoe UI Emoji"/>
+              </w:rPr>
+              <w:t>🟢</w:t>
+            </w:r>
+          </w:p>
+        </w:tc>
+        <w:tc>
+          <w:tcPr>
+            <w:tcW w:w="0" w:type="auto"/>
+            <w:vAlign w:val="center"/>
+            <w:hideMark/>
+          </w:tcPr>
+          <w:p>
+            <w:r>
+              <w:rPr>
+                <w:rFonts w:ascii="Segoe UI Emoji" w:hAnsi="Segoe UI Emoji" w:cs="Segoe UI Emoji"/>
+              </w:rPr>
+              <w:t>🟠</w:t>
+            </w:r>
+          </w:p>
+        </w:tc>
+        <w:tc>
+          <w:tcPr>
+            <w:tcW w:w="0" w:type="auto"/>
+            <w:vAlign w:val="center"/>
+            <w:hideMark/>
+          </w:tcPr>
+          <w:p>
+            <w:r>
+              <w:rPr>
+                <w:rFonts w:ascii="Segoe UI Emoji" w:hAnsi="Segoe UI Emoji" w:cs="Segoe UI Emoji"/>
+              </w:rPr>
+              <w:t>🟠</w:t>
+            </w:r>
+          </w:p>
+        </w:tc>
+        <w:tc>
+          <w:tcPr>
+            <w:tcW w:w="0" w:type="auto"/>
+            <w:vAlign w:val="center"/>
+            <w:hideMark/>
+          </w:tcPr>
+          <w:p>
+            <w:r>
+              <w:rPr>
+                <w:rFonts w:ascii="Segoe UI Emoji" w:hAnsi="Segoe UI Emoji" w:cs="Segoe UI Emoji"/>
+              </w:rPr>
+              <w:t>🟠</w:t>
+            </w:r>
+          </w:p>
+        </w:tc>
+        <w:tc>
+          <w:tcPr>
+            <w:tcW w:w="0" w:type="auto"/>
+            <w:vAlign w:val="center"/>
+            <w:hideMark/>
+          </w:tcPr>
+          <w:p>
+            <w:r>
+              <w:rPr>
+                <w:rFonts w:ascii="Segoe UI Emoji" w:hAnsi="Segoe UI Emoji" w:cs="Segoe UI Emoji"/>
+              </w:rPr>
+              <w:t>🟢</w:t>
+            </w:r>
+          </w:p>
+        </w:tc>
+      </w:tr>
+    </w:tbl>
+    <w:p>
+      <w:r>
+        <w:pict w14:anchorId="0961020D">
+          <v:rect id="_x0000_i1041" style="width:0;height:1.5pt" o:hralign="center" o:hrstd="t" o:hr="t" fillcolor="#a0a0a0" stroked="f"/>
+        </w:pict>
+      </w:r>
+    </w:p>
+    <w:p>
+      <w:pPr>
+        <w:rPr>
+          <w:b/>
+          <w:bCs/>
+        </w:rPr>
+      </w:pPr>
+      <w:r>
+        <w:rPr>
+          <w:b/>
+          <w:bCs/>
+        </w:rPr>
+        <w:t>Visual Summary (Heat Intensity)</w:t>
+      </w:r>
+    </w:p>
+    <w:tbl>
+      <w:tblPr>
+        <w:tblW w:w="0" w:type="auto"/>
+        <w:tblCellSpacing w:w="15" w:type="dxa"/>
+        <w:tblCellMar>
+          <w:top w:w="15" w:type="dxa"/>
+          <w:left w:w="15" w:type="dxa"/>
+          <w:bottom w:w="15" w:type="dxa"/>
+          <w:right w:w="15" w:type="dxa"/>
+        </w:tblCellMar>
+        <w:tblLook w:val="04A0" w:firstRow="1" w:lastRow="0" w:firstColumn="1" w:lastColumn="0" w:noHBand="0" w:noVBand="1"/>
+      </w:tblPr>
+      <w:tblGrid>
+        <w:gridCol w:w="3854"/>
+        <w:gridCol w:w="10104"/>
+      </w:tblGrid>
+      <w:tr>
+        <w:trPr>
+          <w:tblHeader/>
+          <w:tblCellSpacing w:w="15" w:type="dxa"/>
+        </w:trPr>
+        <w:tc>
+          <w:tcPr>
+            <w:tcW w:w="0" w:type="auto"/>
+            <w:vAlign w:val="center"/>
+            <w:hideMark/>
+          </w:tcPr>
+          <w:p>
+            <w:pPr>
+              <w:rPr>
+                <w:b/>
+                <w:bCs/>
+              </w:rPr>
+            </w:pPr>
+            <w:r>
+              <w:rPr>
+                <w:b/>
+                <w:bCs/>
+              </w:rPr>
+              <w:t>Heat Level</w:t>
+            </w:r>
+          </w:p>
+        </w:tc>
+        <w:tc>
+          <w:tcPr>
+            <w:tcW w:w="0" w:type="auto"/>
+            <w:vAlign w:val="center"/>
+            <w:hideMark/>
+          </w:tcPr>
+          <w:p>
+            <w:pPr>
+              <w:rPr>
+                <w:b/>
+                <w:bCs/>
+              </w:rPr>
+            </w:pPr>
+            <w:r>
+              <w:rPr>
+                <w:b/>
+                <w:bCs/>
+              </w:rPr>
+              <w:t>Systems</w:t>
+            </w:r>
+          </w:p>
+        </w:tc>
+      </w:tr>
+      <w:tr>
+        <w:trPr>
+          <w:tblCellSpacing w:w="15" w:type="dxa"/>
+        </w:trPr>
+        <w:tc>
+          <w:tcPr>
+            <w:tcW w:w="0" w:type="auto"/>
+            <w:vAlign w:val="center"/>
+            <w:hideMark/>
+          </w:tcPr>
+          <w:p>
+            <w:r>
+              <w:rPr>
+                <w:rFonts w:ascii="Segoe UI Emoji" w:hAnsi="Segoe UI Emoji" w:cs="Segoe UI Emoji"/>
+              </w:rPr>
+              <w:t>🔴</w:t>
+            </w:r>
+            <w:r>
+              <w:t xml:space="preserve"> </w:t>
+            </w:r>
+            <w:r>
+              <w:rPr>
+                <w:b/>
+                <w:bCs/>
+              </w:rPr>
+              <w:t>Hottest</w:t>
+            </w:r>
+            <w:r>
+              <w:t xml:space="preserve"> (Strong red across most stages)</w:t>
+            </w:r>
+          </w:p>
+        </w:tc>
+        <w:tc>
+          <w:tcPr>
+            <w:tcW w:w="0" w:type="auto"/>
+            <w:vAlign w:val="center"/>
+            <w:hideMark/>
+          </w:tcPr>
+          <w:p>
+            <w:r>
+              <w:t>3. Ventilation 4. Medical Gases 10. Domestic Hot &amp; Cold Water 11. Chilled Water / Cooling 16. Above-ground Drainage</w:t>
+            </w:r>
+          </w:p>
+        </w:tc>
+      </w:tr>
+      <w:tr>
+        <w:trPr>
+          <w:tblCellSpacing w:w="15" w:type="dxa"/>
+        </w:trPr>
+        <w:tc>
+          <w:tcPr>
+            <w:tcW w:w="0" w:type="auto"/>
+            <w:vAlign w:val="center"/>
+            <w:hideMark/>
+          </w:tcPr>
+          <w:p>
+            <w:r>
+              <w:rPr>
+                <w:rFonts w:ascii="Segoe UI Emoji" w:hAnsi="Segoe UI Emoji" w:cs="Segoe UI Emoji"/>
+              </w:rPr>
+              <w:t>🟠</w:t>
+            </w:r>
+            <w:r>
+              <w:t xml:space="preserve"> </w:t>
+            </w:r>
+            <w:r>
+              <w:rPr>
+                <w:b/>
+                <w:bCs/>
+              </w:rPr>
+              <w:t>Medium</w:t>
+            </w:r>
+          </w:p>
+        </w:tc>
+        <w:tc>
+          <w:tcPr>
+            <w:tcW w:w="0" w:type="auto"/>
+            <w:vAlign w:val="center"/>
+            <w:hideMark/>
+          </w:tcPr>
+          <w:p>
+            <w:r>
+              <w:t>Heating/Boilers, Lifts, Electrical, Steam, Fire Suppression, Pneumatic Tube</w:t>
+            </w:r>
+          </w:p>
+        </w:tc>
+      </w:tr>
+      <w:tr>
+        <w:trPr>
+          <w:tblCellSpacing w:w="15" w:type="dxa"/>
+        </w:trPr>
+        <w:tc>
+          <w:tcPr>
+            <w:tcW w:w="0" w:type="auto"/>
+            <w:vAlign w:val="center"/>
+            <w:hideMark/>
+          </w:tcPr>
+          <w:p>
+            <w:r>
+              <w:rPr>
+                <w:rFonts w:ascii="Segoe UI Emoji" w:hAnsi="Segoe UI Emoji" w:cs="Segoe UI Emoji"/>
+              </w:rPr>
+              <w:t>🟢</w:t>
+            </w:r>
+            <w:r>
+              <w:t xml:space="preserve"> </w:t>
+            </w:r>
+            <w:r>
+              <w:rPr>
+                <w:b/>
+                <w:bCs/>
+              </w:rPr>
+              <w:t>Cooler</w:t>
+            </w:r>
+          </w:p>
+        </w:tc>
+        <w:tc>
+          <w:tcPr>
+            <w:tcW w:w="0" w:type="auto"/>
+            <w:vAlign w:val="center"/>
+            <w:hideMark/>
+          </w:tcPr>
+          <w:p>
+            <w:r>
+              <w:t>Fire Alarm, Nurse Call, BMS, Security, Compressed Air</w:t>
+            </w:r>
+          </w:p>
+        </w:tc>
+      </w:tr>
+    </w:tbl>
+    <w:p>
+      <w:r>
+        <w:pict w14:anchorId="69986212">
+          <v:rect id="_x0000_i1042" style="width:0;height:1.5pt" o:hralign="center" o:hrstd="t" o:hr="t" fillcolor="#a0a0a0" stroked="f"/>
+        </w:pict>
+      </w:r>
+    </w:p>
+    <w:p>
+      <w:r>
+        <w:t>This version gives a clear graphical coloured heat map using emoji.</w:t>
+      </w:r>
+    </w:p>
     <w:p/>
     <w:sectPr>
-      <w:pgSz w:w="11906" w:h="16838"/>
+      <w:pgSz w:w="16838" w:h="11906" w:orient="landscape"/>
       <w:pgMar w:top="1440" w:right="1440" w:bottom="1440" w:left="1440" w:header="708" w:footer="708" w:gutter="0"/>
       <w:cols w:space="708"/>
       <w:docGrid w:linePitch="360"/>

</xml_diff>